<commit_message>
Updated Experiment 2 with output and readme file
</commit_message>
<xml_diff>
--- a/Experiment_2/Experiment_2.docx
+++ b/Experiment_2/Experiment_2.docx
@@ -157,6 +157,7 @@
               </w:rPr>
               <w:t xml:space="preserve">Semester: </w:t>
             </w:r>
+            <w:proofErr w:type="spellStart"/>
             <w:r>
               <w:rPr>
                 <w:rFonts w:ascii="Times New Roman" w:hAnsi="Times New Roman" w:cs="Times New Roman"/>
@@ -178,6 +179,7 @@
               </w:rPr>
               <w:t>nd</w:t>
             </w:r>
+            <w:proofErr w:type="spellEnd"/>
           </w:p>
           <w:p>
             <w:pPr>
@@ -397,6 +399,38 @@
     </w:p>
     <w:p>
       <w:pPr>
+        <w:jc w:val="both"/>
+        <w:rPr>
+          <w:rFonts w:ascii="Times New Roman" w:hAnsi="Times New Roman" w:cs="Times New Roman"/>
+          <w:b/>
+          <w:bCs/>
+          <w:sz w:val="28"/>
+          <w:szCs w:val="28"/>
+        </w:rPr>
+      </w:pPr>
+      <w:r>
+        <w:rPr>
+          <w:rFonts w:ascii="Times New Roman" w:hAnsi="Times New Roman" w:cs="Times New Roman"/>
+          <w:b/>
+          <w:bCs/>
+          <w:sz w:val="28"/>
+          <w:szCs w:val="28"/>
+        </w:rPr>
+        <w:t xml:space="preserve">Title: </w:t>
+      </w:r>
+      <w:r>
+        <w:rPr>
+          <w:rFonts w:ascii="Times New Roman" w:hAnsi="Times New Roman" w:cs="Times New Roman"/>
+          <w:b/>
+          <w:bCs/>
+          <w:sz w:val="28"/>
+          <w:szCs w:val="28"/>
+        </w:rPr>
+        <w:t>Implementation of SELECT Queries with Filtering, Grouping and Sorting in PostgreSQL</w:t>
+      </w:r>
+    </w:p>
+    <w:p>
+      <w:pPr>
         <w:pStyle w:val="ListParagraph"/>
         <w:numPr>
           <w:ilvl w:val="0"/>
@@ -467,21 +501,27 @@
         <w:jc w:val="both"/>
         <w:rPr>
           <w:rFonts w:ascii="Times New Roman" w:hAnsi="Times New Roman" w:cs="Times New Roman"/>
+          <w:sz w:val="28"/>
+          <w:szCs w:val="28"/>
+        </w:rPr>
+      </w:pPr>
+      <w:r>
+        <w:rPr>
+          <w:rFonts w:ascii="Times New Roman" w:hAnsi="Times New Roman" w:cs="Times New Roman"/>
           <w:b/>
           <w:bCs/>
           <w:sz w:val="28"/>
           <w:szCs w:val="28"/>
         </w:rPr>
-      </w:pPr>
-      <w:r>
-        <w:rPr>
-          <w:rFonts w:ascii="Times New Roman" w:hAnsi="Times New Roman" w:cs="Times New Roman"/>
-          <w:b/>
-          <w:bCs/>
-          <w:sz w:val="28"/>
-          <w:szCs w:val="28"/>
-        </w:rPr>
-        <w:t>Objective:</w:t>
+        <w:t>Software Requirements</w:t>
+      </w:r>
+      <w:r>
+        <w:rPr>
+          <w:rFonts w:ascii="Times New Roman" w:hAnsi="Times New Roman" w:cs="Times New Roman"/>
+          <w:sz w:val="28"/>
+          <w:szCs w:val="28"/>
+        </w:rPr>
+        <w:t>:</w:t>
       </w:r>
     </w:p>
     <w:p>
@@ -500,11 +540,11 @@
       </w:pPr>
       <w:r>
         <w:rPr>
-          <w:rFonts w:ascii="Times New Roman" w:hAnsi="Times New Roman" w:cs="Times New Roman" w:hint="eastAsia"/>
-          <w:sz w:val="28"/>
-          <w:szCs w:val="28"/>
-        </w:rPr>
-        <w:t>To retrieve specific data using filtering conditions</w:t>
+          <w:rFonts w:ascii="Times New Roman" w:hAnsi="Times New Roman" w:cs="Times New Roman"/>
+          <w:sz w:val="28"/>
+          <w:szCs w:val="28"/>
+        </w:rPr>
+        <w:t>PostgreSQL (Database Server)</w:t>
       </w:r>
     </w:p>
     <w:p>
@@ -521,14 +561,16 @@
           <w:szCs w:val="28"/>
         </w:rPr>
       </w:pPr>
-      <w:r>
-        <w:rPr>
-          <w:rFonts w:ascii="Times New Roman" w:hAnsi="Times New Roman" w:cs="Times New Roman" w:hint="eastAsia"/>
-          <w:sz w:val="28"/>
-          <w:szCs w:val="28"/>
-        </w:rPr>
-        <w:t>To sort query results using single and multiple attributes</w:t>
-      </w:r>
+      <w:proofErr w:type="spellStart"/>
+      <w:r>
+        <w:rPr>
+          <w:rFonts w:ascii="Times New Roman" w:hAnsi="Times New Roman" w:cs="Times New Roman"/>
+          <w:sz w:val="28"/>
+          <w:szCs w:val="28"/>
+        </w:rPr>
+        <w:t>pgAdmin</w:t>
+      </w:r>
+      <w:proofErr w:type="spellEnd"/>
     </w:p>
     <w:p>
       <w:pPr>
@@ -546,11 +588,50 @@
       </w:pPr>
       <w:r>
         <w:rPr>
-          <w:rFonts w:ascii="Times New Roman" w:hAnsi="Times New Roman" w:cs="Times New Roman" w:hint="eastAsia"/>
-          <w:sz w:val="28"/>
-          <w:szCs w:val="28"/>
-        </w:rPr>
-        <w:t>To perform aggregation using grouping techniques</w:t>
+          <w:rFonts w:ascii="Times New Roman" w:hAnsi="Times New Roman" w:cs="Times New Roman"/>
+          <w:sz w:val="28"/>
+          <w:szCs w:val="28"/>
+        </w:rPr>
+        <w:t>OS: Windows</w:t>
+      </w:r>
+    </w:p>
+    <w:p>
+      <w:pPr>
+        <w:pStyle w:val="ListParagraph"/>
+        <w:ind w:left="1440"/>
+        <w:jc w:val="both"/>
+        <w:rPr>
+          <w:rFonts w:ascii="Times New Roman" w:hAnsi="Times New Roman" w:cs="Times New Roman"/>
+          <w:sz w:val="28"/>
+          <w:szCs w:val="28"/>
+        </w:rPr>
+      </w:pPr>
+    </w:p>
+    <w:p>
+      <w:pPr>
+        <w:pStyle w:val="ListParagraph"/>
+        <w:numPr>
+          <w:ilvl w:val="0"/>
+          <w:numId w:val="18"/>
+        </w:numPr>
+        <w:jc w:val="both"/>
+        <w:rPr>
+          <w:rFonts w:ascii="Times New Roman" w:hAnsi="Times New Roman" w:cs="Times New Roman"/>
+          <w:b/>
+          <w:bCs/>
+          <w:sz w:val="28"/>
+          <w:szCs w:val="28"/>
+        </w:rPr>
+      </w:pPr>
+      <w:r>
+        <w:rPr>
+          <w:rFonts w:ascii="Times New Roman" w:hAnsi="Times New Roman" w:cs="Times New Roman"/>
+          <w:b/>
+          <w:bCs/>
+          <w:sz w:val="28"/>
+          <w:szCs w:val="28"/>
+        </w:rPr>
+        <w:t>Objective:</w:t>
       </w:r>
     </w:p>
     <w:p>
@@ -573,7 +654,7 @@
           <w:sz w:val="28"/>
           <w:szCs w:val="28"/>
         </w:rPr>
-        <w:t>To apply conditions on aggregated data</w:t>
+        <w:t>To retrieve specific data using filtering conditions</w:t>
       </w:r>
     </w:p>
     <w:p>
@@ -592,6 +673,75 @@
       </w:pPr>
       <w:r>
         <w:rPr>
+          <w:rFonts w:ascii="Times New Roman" w:hAnsi="Times New Roman" w:cs="Times New Roman" w:hint="eastAsia"/>
+          <w:sz w:val="28"/>
+          <w:szCs w:val="28"/>
+        </w:rPr>
+        <w:t>To sort query results using single and multiple attributes</w:t>
+      </w:r>
+    </w:p>
+    <w:p>
+      <w:pPr>
+        <w:pStyle w:val="ListParagraph"/>
+        <w:numPr>
+          <w:ilvl w:val="1"/>
+          <w:numId w:val="18"/>
+        </w:numPr>
+        <w:jc w:val="both"/>
+        <w:rPr>
+          <w:rFonts w:ascii="Times New Roman" w:hAnsi="Times New Roman" w:cs="Times New Roman"/>
+          <w:sz w:val="28"/>
+          <w:szCs w:val="28"/>
+        </w:rPr>
+      </w:pPr>
+      <w:r>
+        <w:rPr>
+          <w:rFonts w:ascii="Times New Roman" w:hAnsi="Times New Roman" w:cs="Times New Roman" w:hint="eastAsia"/>
+          <w:sz w:val="28"/>
+          <w:szCs w:val="28"/>
+        </w:rPr>
+        <w:t>To perform aggregation using grouping techniques</w:t>
+      </w:r>
+    </w:p>
+    <w:p>
+      <w:pPr>
+        <w:pStyle w:val="ListParagraph"/>
+        <w:numPr>
+          <w:ilvl w:val="1"/>
+          <w:numId w:val="18"/>
+        </w:numPr>
+        <w:jc w:val="both"/>
+        <w:rPr>
+          <w:rFonts w:ascii="Times New Roman" w:hAnsi="Times New Roman" w:cs="Times New Roman"/>
+          <w:sz w:val="28"/>
+          <w:szCs w:val="28"/>
+        </w:rPr>
+      </w:pPr>
+      <w:r>
+        <w:rPr>
+          <w:rFonts w:ascii="Times New Roman" w:hAnsi="Times New Roman" w:cs="Times New Roman" w:hint="eastAsia"/>
+          <w:sz w:val="28"/>
+          <w:szCs w:val="28"/>
+        </w:rPr>
+        <w:t>To apply conditions on aggregated data</w:t>
+      </w:r>
+    </w:p>
+    <w:p>
+      <w:pPr>
+        <w:pStyle w:val="ListParagraph"/>
+        <w:numPr>
+          <w:ilvl w:val="1"/>
+          <w:numId w:val="18"/>
+        </w:numPr>
+        <w:jc w:val="both"/>
+        <w:rPr>
+          <w:rFonts w:ascii="Times New Roman" w:hAnsi="Times New Roman" w:cs="Times New Roman"/>
+          <w:sz w:val="28"/>
+          <w:szCs w:val="28"/>
+        </w:rPr>
+      </w:pPr>
+      <w:r>
+        <w:rPr>
           <w:rFonts w:ascii="Times New Roman" w:hAnsi="Times New Roman" w:cs="Times New Roman"/>
           <w:sz w:val="28"/>
           <w:szCs w:val="28"/>
@@ -621,31 +771,19 @@
         <w:jc w:val="both"/>
         <w:rPr>
           <w:rFonts w:ascii="Times New Roman" w:hAnsi="Times New Roman" w:cs="Times New Roman"/>
+          <w:sz w:val="28"/>
+          <w:szCs w:val="28"/>
+        </w:rPr>
+      </w:pPr>
+      <w:r>
+        <w:rPr>
+          <w:rFonts w:ascii="Times New Roman" w:hAnsi="Times New Roman" w:cs="Times New Roman"/>
           <w:b/>
           <w:bCs/>
           <w:sz w:val="28"/>
           <w:szCs w:val="28"/>
         </w:rPr>
-      </w:pPr>
-      <w:r>
-        <w:rPr>
-          <w:rFonts w:ascii="Times New Roman" w:hAnsi="Times New Roman" w:cs="Times New Roman"/>
-          <w:b/>
-          <w:bCs/>
-          <w:sz w:val="28"/>
-          <w:szCs w:val="28"/>
-        </w:rPr>
-        <w:t>Experiment Steps</w:t>
-      </w:r>
-      <w:r>
-        <w:rPr>
-          <w:rFonts w:ascii="Times New Roman" w:hAnsi="Times New Roman" w:cs="Times New Roman"/>
-          <w:b/>
-          <w:bCs/>
-          <w:sz w:val="28"/>
-          <w:szCs w:val="28"/>
-        </w:rPr>
-        <w:t>:</w:t>
+        <w:t>Procedure of the Practical:</w:t>
       </w:r>
     </w:p>
     <w:p>
@@ -668,6 +806,224 @@
           <w:sz w:val="28"/>
           <w:szCs w:val="28"/>
         </w:rPr>
+        <w:t>Start the system.</w:t>
+      </w:r>
+    </w:p>
+    <w:p>
+      <w:pPr>
+        <w:pStyle w:val="ListParagraph"/>
+        <w:numPr>
+          <w:ilvl w:val="1"/>
+          <w:numId w:val="18"/>
+        </w:numPr>
+        <w:jc w:val="both"/>
+        <w:rPr>
+          <w:rFonts w:ascii="Times New Roman" w:hAnsi="Times New Roman" w:cs="Times New Roman"/>
+          <w:sz w:val="28"/>
+          <w:szCs w:val="28"/>
+        </w:rPr>
+      </w:pPr>
+      <w:r>
+        <w:rPr>
+          <w:rFonts w:ascii="Times New Roman" w:hAnsi="Times New Roman" w:cs="Times New Roman"/>
+          <w:sz w:val="28"/>
+          <w:szCs w:val="28"/>
+        </w:rPr>
+        <w:t xml:space="preserve">Open </w:t>
+      </w:r>
+      <w:proofErr w:type="spellStart"/>
+      <w:r>
+        <w:rPr>
+          <w:rFonts w:ascii="Times New Roman" w:hAnsi="Times New Roman" w:cs="Times New Roman"/>
+          <w:sz w:val="28"/>
+          <w:szCs w:val="28"/>
+        </w:rPr>
+        <w:t>pgAdmin</w:t>
+      </w:r>
+      <w:proofErr w:type="spellEnd"/>
+      <w:r>
+        <w:rPr>
+          <w:rFonts w:ascii="Times New Roman" w:hAnsi="Times New Roman" w:cs="Times New Roman"/>
+          <w:sz w:val="28"/>
+          <w:szCs w:val="28"/>
+        </w:rPr>
+        <w:t>.</w:t>
+      </w:r>
+    </w:p>
+    <w:p>
+      <w:pPr>
+        <w:pStyle w:val="ListParagraph"/>
+        <w:numPr>
+          <w:ilvl w:val="1"/>
+          <w:numId w:val="18"/>
+        </w:numPr>
+        <w:jc w:val="both"/>
+        <w:rPr>
+          <w:rFonts w:ascii="Times New Roman" w:hAnsi="Times New Roman" w:cs="Times New Roman"/>
+          <w:sz w:val="28"/>
+          <w:szCs w:val="28"/>
+        </w:rPr>
+      </w:pPr>
+      <w:r>
+        <w:rPr>
+          <w:rFonts w:ascii="Times New Roman" w:hAnsi="Times New Roman" w:cs="Times New Roman"/>
+          <w:sz w:val="28"/>
+          <w:szCs w:val="28"/>
+        </w:rPr>
+        <w:t>Create and select the database in which you want to perform the experiment.</w:t>
+      </w:r>
+    </w:p>
+    <w:p>
+      <w:pPr>
+        <w:pStyle w:val="ListParagraph"/>
+        <w:numPr>
+          <w:ilvl w:val="1"/>
+          <w:numId w:val="18"/>
+        </w:numPr>
+        <w:jc w:val="both"/>
+        <w:rPr>
+          <w:rFonts w:ascii="Times New Roman" w:hAnsi="Times New Roman" w:cs="Times New Roman"/>
+          <w:sz w:val="28"/>
+          <w:szCs w:val="28"/>
+        </w:rPr>
+      </w:pPr>
+      <w:r>
+        <w:rPr>
+          <w:rFonts w:ascii="Times New Roman" w:hAnsi="Times New Roman" w:cs="Times New Roman"/>
+          <w:sz w:val="28"/>
+          <w:szCs w:val="28"/>
+        </w:rPr>
+        <w:t xml:space="preserve">Establish connection to the database using </w:t>
+      </w:r>
+      <w:proofErr w:type="spellStart"/>
+      <w:r>
+        <w:rPr>
+          <w:rFonts w:ascii="Times New Roman" w:hAnsi="Times New Roman" w:cs="Times New Roman"/>
+          <w:sz w:val="28"/>
+          <w:szCs w:val="28"/>
+        </w:rPr>
+        <w:t>Alt+Shift+Q</w:t>
+      </w:r>
+      <w:proofErr w:type="spellEnd"/>
+      <w:r>
+        <w:rPr>
+          <w:rFonts w:ascii="Times New Roman" w:hAnsi="Times New Roman" w:cs="Times New Roman"/>
+          <w:sz w:val="28"/>
+          <w:szCs w:val="28"/>
+        </w:rPr>
+        <w:t>.</w:t>
+      </w:r>
+    </w:p>
+    <w:p>
+      <w:pPr>
+        <w:pStyle w:val="ListParagraph"/>
+        <w:numPr>
+          <w:ilvl w:val="1"/>
+          <w:numId w:val="18"/>
+        </w:numPr>
+        <w:jc w:val="both"/>
+        <w:rPr>
+          <w:rFonts w:ascii="Times New Roman" w:hAnsi="Times New Roman" w:cs="Times New Roman"/>
+          <w:sz w:val="28"/>
+          <w:szCs w:val="28"/>
+        </w:rPr>
+      </w:pPr>
+      <w:r>
+        <w:rPr>
+          <w:rFonts w:ascii="Times New Roman" w:hAnsi="Times New Roman" w:cs="Times New Roman"/>
+          <w:sz w:val="28"/>
+          <w:szCs w:val="28"/>
+        </w:rPr>
+        <w:t>Run the following queries given in Experiment Steps (5).</w:t>
+      </w:r>
+    </w:p>
+    <w:p>
+      <w:pPr>
+        <w:spacing w:after="0" w:line="240" w:lineRule="auto"/>
+        <w:rPr>
+          <w:rFonts w:ascii="Times New Roman" w:hAnsi="Times New Roman" w:cs="Times New Roman"/>
+          <w:sz w:val="28"/>
+          <w:szCs w:val="28"/>
+        </w:rPr>
+      </w:pPr>
+      <w:r>
+        <w:rPr>
+          <w:rFonts w:ascii="Times New Roman" w:hAnsi="Times New Roman" w:cs="Times New Roman"/>
+          <w:sz w:val="28"/>
+          <w:szCs w:val="28"/>
+        </w:rPr>
+        <w:br w:type="page"/>
+      </w:r>
+    </w:p>
+    <w:p>
+      <w:pPr>
+        <w:pStyle w:val="ListParagraph"/>
+        <w:ind w:left="1440"/>
+        <w:jc w:val="both"/>
+        <w:rPr>
+          <w:rFonts w:ascii="Times New Roman" w:hAnsi="Times New Roman" w:cs="Times New Roman"/>
+          <w:sz w:val="28"/>
+          <w:szCs w:val="28"/>
+        </w:rPr>
+      </w:pPr>
+    </w:p>
+    <w:p>
+      <w:pPr>
+        <w:pStyle w:val="ListParagraph"/>
+        <w:numPr>
+          <w:ilvl w:val="0"/>
+          <w:numId w:val="18"/>
+        </w:numPr>
+        <w:jc w:val="both"/>
+        <w:rPr>
+          <w:rFonts w:ascii="Times New Roman" w:hAnsi="Times New Roman" w:cs="Times New Roman"/>
+          <w:b/>
+          <w:bCs/>
+          <w:sz w:val="28"/>
+          <w:szCs w:val="28"/>
+        </w:rPr>
+      </w:pPr>
+      <w:r>
+        <w:rPr>
+          <w:rFonts w:ascii="Times New Roman" w:hAnsi="Times New Roman" w:cs="Times New Roman"/>
+          <w:b/>
+          <w:bCs/>
+          <w:sz w:val="28"/>
+          <w:szCs w:val="28"/>
+        </w:rPr>
+        <w:t>Experiment Steps</w:t>
+      </w:r>
+      <w:r>
+        <w:rPr>
+          <w:rFonts w:ascii="Times New Roman" w:hAnsi="Times New Roman" w:cs="Times New Roman"/>
+          <w:b/>
+          <w:bCs/>
+          <w:sz w:val="28"/>
+          <w:szCs w:val="28"/>
+        </w:rPr>
+        <w:t>:</w:t>
+      </w:r>
+    </w:p>
+    <w:p>
+      <w:pPr>
+        <w:pStyle w:val="ListParagraph"/>
+        <w:numPr>
+          <w:ilvl w:val="1"/>
+          <w:numId w:val="18"/>
+        </w:numPr>
+        <w:jc w:val="both"/>
+        <w:rPr>
+          <w:rFonts w:ascii="Times New Roman" w:hAnsi="Times New Roman" w:cs="Times New Roman"/>
+          <w:sz w:val="28"/>
+          <w:szCs w:val="28"/>
+        </w:rPr>
+      </w:pPr>
+      <w:r>
+        <w:rPr>
+          <w:rFonts w:ascii="Times New Roman" w:hAnsi="Times New Roman" w:cs="Times New Roman"/>
+          <w:sz w:val="28"/>
+          <w:szCs w:val="28"/>
+        </w:rPr>
         <w:t>C</w:t>
       </w:r>
       <w:r>
@@ -707,7 +1063,43 @@
           <w:sz w:val="24"/>
           <w:szCs w:val="24"/>
         </w:rPr>
-        <w:t>Create table customer_orders (order_id int primary key,</w:t>
+        <w:t xml:space="preserve">Create table </w:t>
+      </w:r>
+      <w:proofErr w:type="spellStart"/>
+      <w:r>
+        <w:rPr>
+          <w:rFonts w:ascii="Times New Roman" w:hAnsi="Times New Roman" w:cs="Times New Roman"/>
+          <w:sz w:val="24"/>
+          <w:szCs w:val="24"/>
+        </w:rPr>
+        <w:t>customer_orders</w:t>
+      </w:r>
+      <w:proofErr w:type="spellEnd"/>
+      <w:r>
+        <w:rPr>
+          <w:rFonts w:ascii="Times New Roman" w:hAnsi="Times New Roman" w:cs="Times New Roman"/>
+          <w:sz w:val="24"/>
+          <w:szCs w:val="24"/>
+        </w:rPr>
+        <w:t xml:space="preserve"> (</w:t>
+      </w:r>
+      <w:proofErr w:type="spellStart"/>
+      <w:r>
+        <w:rPr>
+          <w:rFonts w:ascii="Times New Roman" w:hAnsi="Times New Roman" w:cs="Times New Roman"/>
+          <w:sz w:val="24"/>
+          <w:szCs w:val="24"/>
+        </w:rPr>
+        <w:t>order_id</w:t>
+      </w:r>
+      <w:proofErr w:type="spellEnd"/>
+      <w:r>
+        <w:rPr>
+          <w:rFonts w:ascii="Times New Roman" w:hAnsi="Times New Roman" w:cs="Times New Roman"/>
+          <w:sz w:val="24"/>
+          <w:szCs w:val="24"/>
+        </w:rPr>
+        <w:t xml:space="preserve"> int primary key,</w:t>
       </w:r>
       <w:r>
         <w:rPr>
@@ -717,14 +1109,16 @@
         </w:rPr>
         <w:t xml:space="preserve"> </w:t>
       </w:r>
-      <w:r>
-        <w:rPr>
-          <w:rFonts w:ascii="Times New Roman" w:hAnsi="Times New Roman" w:cs="Times New Roman"/>
-          <w:sz w:val="24"/>
-          <w:szCs w:val="24"/>
-        </w:rPr>
-        <w:t>customer_name varchar(30) not null,</w:t>
-      </w:r>
+      <w:proofErr w:type="spellStart"/>
+      <w:r>
+        <w:rPr>
+          <w:rFonts w:ascii="Times New Roman" w:hAnsi="Times New Roman" w:cs="Times New Roman"/>
+          <w:sz w:val="24"/>
+          <w:szCs w:val="24"/>
+        </w:rPr>
+        <w:t>customer_name</w:t>
+      </w:r>
+      <w:proofErr w:type="spellEnd"/>
       <w:r>
         <w:rPr>
           <w:rFonts w:ascii="Times New Roman" w:hAnsi="Times New Roman" w:cs="Times New Roman"/>
@@ -733,13 +1127,23 @@
         </w:rPr>
         <w:t xml:space="preserve"> </w:t>
       </w:r>
-      <w:r>
-        <w:rPr>
-          <w:rFonts w:ascii="Times New Roman" w:hAnsi="Times New Roman" w:cs="Times New Roman"/>
-          <w:sz w:val="24"/>
-          <w:szCs w:val="24"/>
-        </w:rPr>
-        <w:t>product varchar(50) not null, quantity int not null check (quantity &gt; 0),</w:t>
+      <w:proofErr w:type="gramStart"/>
+      <w:r>
+        <w:rPr>
+          <w:rFonts w:ascii="Times New Roman" w:hAnsi="Times New Roman" w:cs="Times New Roman"/>
+          <w:sz w:val="24"/>
+          <w:szCs w:val="24"/>
+        </w:rPr>
+        <w:t>varchar(</w:t>
+      </w:r>
+      <w:proofErr w:type="gramEnd"/>
+      <w:r>
+        <w:rPr>
+          <w:rFonts w:ascii="Times New Roman" w:hAnsi="Times New Roman" w:cs="Times New Roman"/>
+          <w:sz w:val="24"/>
+          <w:szCs w:val="24"/>
+        </w:rPr>
+        <w:t>30) not null,</w:t>
       </w:r>
       <w:r>
         <w:rPr>
@@ -755,7 +1159,25 @@
           <w:sz w:val="24"/>
           <w:szCs w:val="24"/>
         </w:rPr>
-        <w:t>price decimal(8, 2) not null check (price &gt;= 0),</w:t>
+        <w:t xml:space="preserve">product </w:t>
+      </w:r>
+      <w:proofErr w:type="gramStart"/>
+      <w:r>
+        <w:rPr>
+          <w:rFonts w:ascii="Times New Roman" w:hAnsi="Times New Roman" w:cs="Times New Roman"/>
+          <w:sz w:val="24"/>
+          <w:szCs w:val="24"/>
+        </w:rPr>
+        <w:t>varchar(</w:t>
+      </w:r>
+      <w:proofErr w:type="gramEnd"/>
+      <w:r>
+        <w:rPr>
+          <w:rFonts w:ascii="Times New Roman" w:hAnsi="Times New Roman" w:cs="Times New Roman"/>
+          <w:sz w:val="24"/>
+          <w:szCs w:val="24"/>
+        </w:rPr>
+        <w:t>50) not null, quantity int not null check (quantity &gt; 0),</w:t>
       </w:r>
       <w:r>
         <w:rPr>
@@ -771,8 +1193,53 @@
           <w:sz w:val="24"/>
           <w:szCs w:val="24"/>
         </w:rPr>
-        <w:t>order_date date not null</w:t>
-      </w:r>
+        <w:t xml:space="preserve">price </w:t>
+      </w:r>
+      <w:proofErr w:type="gramStart"/>
+      <w:r>
+        <w:rPr>
+          <w:rFonts w:ascii="Times New Roman" w:hAnsi="Times New Roman" w:cs="Times New Roman"/>
+          <w:sz w:val="24"/>
+          <w:szCs w:val="24"/>
+        </w:rPr>
+        <w:t>decimal(</w:t>
+      </w:r>
+      <w:proofErr w:type="gramEnd"/>
+      <w:r>
+        <w:rPr>
+          <w:rFonts w:ascii="Times New Roman" w:hAnsi="Times New Roman" w:cs="Times New Roman"/>
+          <w:sz w:val="24"/>
+          <w:szCs w:val="24"/>
+        </w:rPr>
+        <w:t>8, 2) not null check (price &gt;= 0),</w:t>
+      </w:r>
+      <w:r>
+        <w:rPr>
+          <w:rFonts w:ascii="Times New Roman" w:hAnsi="Times New Roman" w:cs="Times New Roman"/>
+          <w:sz w:val="24"/>
+          <w:szCs w:val="24"/>
+        </w:rPr>
+        <w:t xml:space="preserve"> </w:t>
+      </w:r>
+      <w:proofErr w:type="spellStart"/>
+      <w:r>
+        <w:rPr>
+          <w:rFonts w:ascii="Times New Roman" w:hAnsi="Times New Roman" w:cs="Times New Roman"/>
+          <w:sz w:val="24"/>
+          <w:szCs w:val="24"/>
+        </w:rPr>
+        <w:t>order_date</w:t>
+      </w:r>
+      <w:proofErr w:type="spellEnd"/>
+      <w:r>
+        <w:rPr>
+          <w:rFonts w:ascii="Times New Roman" w:hAnsi="Times New Roman" w:cs="Times New Roman"/>
+          <w:sz w:val="24"/>
+          <w:szCs w:val="24"/>
+        </w:rPr>
+        <w:t xml:space="preserve"> date not null</w:t>
+      </w:r>
+      <w:proofErr w:type="gramStart"/>
       <w:r>
         <w:rPr>
           <w:rFonts w:ascii="Times New Roman" w:hAnsi="Times New Roman" w:cs="Times New Roman"/>
@@ -781,11 +1248,12 @@
         </w:rPr>
         <w:t>);</w:t>
       </w:r>
+      <w:proofErr w:type="gramEnd"/>
     </w:p>
     <w:p>
       <w:pPr>
         <w:pStyle w:val="ListParagraph"/>
-        <w:ind w:left="1440"/>
+        <w:ind w:left="2160"/>
         <w:jc w:val="both"/>
         <w:rPr>
           <w:rFonts w:ascii="Times New Roman" w:hAnsi="Times New Roman" w:cs="Times New Roman"/>
@@ -847,6 +1315,7 @@
         </w:rPr>
         <w:t xml:space="preserve"> </w:t>
       </w:r>
+      <w:proofErr w:type="spellStart"/>
       <w:r>
         <w:rPr>
           <w:rFonts w:ascii="Times New Roman" w:hAnsi="Times New Roman" w:cs="Times New Roman"/>
@@ -855,6 +1324,7 @@
         </w:rPr>
         <w:t>customer_orders</w:t>
       </w:r>
+      <w:proofErr w:type="spellEnd"/>
       <w:r>
         <w:rPr>
           <w:rFonts w:ascii="Times New Roman" w:hAnsi="Times New Roman" w:cs="Times New Roman"/>
@@ -885,8 +1355,18 @@
           <w:sz w:val="24"/>
           <w:szCs w:val="24"/>
         </w:rPr>
-        <w:t>'amit sharma',</w:t>
-      </w:r>
+        <w:t>'</w:t>
+      </w:r>
+      <w:proofErr w:type="spellStart"/>
+      <w:r>
+        <w:rPr>
+          <w:rFonts w:ascii="Times New Roman" w:hAnsi="Times New Roman" w:cs="Times New Roman"/>
+          <w:sz w:val="24"/>
+          <w:szCs w:val="24"/>
+        </w:rPr>
+        <w:t>amit</w:t>
+      </w:r>
+      <w:proofErr w:type="spellEnd"/>
       <w:r>
         <w:rPr>
           <w:rFonts w:ascii="Times New Roman" w:hAnsi="Times New Roman" w:cs="Times New Roman"/>
@@ -895,6 +1375,32 @@
         </w:rPr>
         <w:t xml:space="preserve"> </w:t>
       </w:r>
+      <w:proofErr w:type="spellStart"/>
+      <w:r>
+        <w:rPr>
+          <w:rFonts w:ascii="Times New Roman" w:hAnsi="Times New Roman" w:cs="Times New Roman"/>
+          <w:sz w:val="24"/>
+          <w:szCs w:val="24"/>
+        </w:rPr>
+        <w:t>sharma</w:t>
+      </w:r>
+      <w:proofErr w:type="spellEnd"/>
+      <w:r>
+        <w:rPr>
+          <w:rFonts w:ascii="Times New Roman" w:hAnsi="Times New Roman" w:cs="Times New Roman"/>
+          <w:sz w:val="24"/>
+          <w:szCs w:val="24"/>
+        </w:rPr>
+        <w:t>',</w:t>
+      </w:r>
+      <w:r>
+        <w:rPr>
+          <w:rFonts w:ascii="Times New Roman" w:hAnsi="Times New Roman" w:cs="Times New Roman"/>
+          <w:sz w:val="24"/>
+          <w:szCs w:val="24"/>
+        </w:rPr>
+        <w:t xml:space="preserve"> </w:t>
+      </w:r>
       <w:r>
         <w:rPr>
           <w:rFonts w:ascii="Times New Roman" w:hAnsi="Times New Roman" w:cs="Times New Roman"/>
@@ -909,1011 +1415,50 @@
           <w:sz w:val="24"/>
           <w:szCs w:val="24"/>
         </w:rPr>
-        <w:t xml:space="preserve"> 1, 55000.00, '2024-01-05' );</w:t>
+        <w:t xml:space="preserve"> 1, 55000.00, '2024-01-05</w:t>
+      </w:r>
+      <w:proofErr w:type="gramStart"/>
+      <w:r>
+        <w:rPr>
+          <w:rFonts w:ascii="Times New Roman" w:hAnsi="Times New Roman" w:cs="Times New Roman"/>
+          <w:sz w:val="24"/>
+          <w:szCs w:val="24"/>
+        </w:rPr>
+        <w:t>' )</w:t>
+      </w:r>
+      <w:proofErr w:type="gramEnd"/>
+      <w:r>
+        <w:rPr>
+          <w:rFonts w:ascii="Times New Roman" w:hAnsi="Times New Roman" w:cs="Times New Roman"/>
+          <w:sz w:val="24"/>
+          <w:szCs w:val="24"/>
+        </w:rPr>
+        <w:t>;</w:t>
       </w:r>
     </w:p>
     <w:p>
       <w:pPr>
         <w:pStyle w:val="ListParagraph"/>
-        <w:ind w:left="1440"/>
-        <w:jc w:val="both"/>
-        <w:rPr>
-          <w:rFonts w:ascii="Times New Roman" w:hAnsi="Times New Roman" w:cs="Times New Roman"/>
-          <w:sz w:val="28"/>
-          <w:szCs w:val="28"/>
-        </w:rPr>
-      </w:pPr>
-    </w:p>
-    <w:p>
-      <w:pPr>
-        <w:pStyle w:val="ListParagraph"/>
-        <w:numPr>
-          <w:ilvl w:val="1"/>
-          <w:numId w:val="18"/>
-        </w:numPr>
-        <w:jc w:val="both"/>
-        <w:rPr>
-          <w:rFonts w:ascii="Times New Roman" w:hAnsi="Times New Roman" w:cs="Times New Roman"/>
-          <w:sz w:val="28"/>
-          <w:szCs w:val="28"/>
-        </w:rPr>
-      </w:pPr>
-      <w:r>
-        <w:rPr>
-          <w:rFonts w:ascii="Times New Roman" w:hAnsi="Times New Roman" w:cs="Times New Roman"/>
-          <w:sz w:val="28"/>
-          <w:szCs w:val="28"/>
-        </w:rPr>
-        <w:t>Filtering Data using conditions</w:t>
-      </w:r>
-    </w:p>
-    <w:p>
-      <w:pPr>
-        <w:pStyle w:val="ListParagraph"/>
-        <w:numPr>
-          <w:ilvl w:val="2"/>
-          <w:numId w:val="18"/>
-        </w:numPr>
-        <w:jc w:val="both"/>
-        <w:rPr>
-          <w:rFonts w:ascii="Times New Roman" w:hAnsi="Times New Roman" w:cs="Times New Roman"/>
-          <w:sz w:val="24"/>
-          <w:szCs w:val="24"/>
-        </w:rPr>
-      </w:pPr>
-      <w:r>
-        <w:rPr>
-          <w:rFonts w:ascii="Times New Roman" w:hAnsi="Times New Roman" w:cs="Times New Roman"/>
-          <w:sz w:val="24"/>
-          <w:szCs w:val="24"/>
-        </w:rPr>
-        <w:t>Select</w:t>
-      </w:r>
-      <w:r>
-        <w:rPr>
-          <w:rFonts w:ascii="Times New Roman" w:hAnsi="Times New Roman" w:cs="Times New Roman"/>
-          <w:sz w:val="24"/>
-          <w:szCs w:val="24"/>
-        </w:rPr>
-        <w:t xml:space="preserve"> * </w:t>
-      </w:r>
-      <w:r>
-        <w:rPr>
-          <w:rFonts w:ascii="Times New Roman" w:hAnsi="Times New Roman" w:cs="Times New Roman"/>
-          <w:sz w:val="24"/>
-          <w:szCs w:val="24"/>
-        </w:rPr>
-        <w:t>from</w:t>
-      </w:r>
-      <w:r>
-        <w:rPr>
-          <w:rFonts w:ascii="Times New Roman" w:hAnsi="Times New Roman" w:cs="Times New Roman"/>
-          <w:sz w:val="24"/>
-          <w:szCs w:val="24"/>
-        </w:rPr>
-        <w:t xml:space="preserve"> </w:t>
-      </w:r>
-      <w:r>
-        <w:rPr>
-          <w:rFonts w:ascii="Times New Roman" w:hAnsi="Times New Roman" w:cs="Times New Roman"/>
-          <w:sz w:val="24"/>
-          <w:szCs w:val="24"/>
-        </w:rPr>
-        <w:t>customer_orders</w:t>
-      </w:r>
-      <w:r>
-        <w:rPr>
-          <w:rFonts w:ascii="Times New Roman" w:hAnsi="Times New Roman" w:cs="Times New Roman"/>
-          <w:sz w:val="24"/>
-          <w:szCs w:val="24"/>
-        </w:rPr>
-        <w:t xml:space="preserve"> </w:t>
-      </w:r>
-      <w:r>
-        <w:rPr>
-          <w:rFonts w:ascii="Times New Roman" w:hAnsi="Times New Roman" w:cs="Times New Roman"/>
-          <w:sz w:val="24"/>
-          <w:szCs w:val="24"/>
-        </w:rPr>
-        <w:t>where</w:t>
-      </w:r>
-      <w:r>
-        <w:rPr>
-          <w:rFonts w:ascii="Times New Roman" w:hAnsi="Times New Roman" w:cs="Times New Roman"/>
-          <w:sz w:val="24"/>
-          <w:szCs w:val="24"/>
-        </w:rPr>
-        <w:t xml:space="preserve"> </w:t>
-      </w:r>
-      <w:r>
-        <w:rPr>
-          <w:rFonts w:ascii="Times New Roman" w:hAnsi="Times New Roman" w:cs="Times New Roman"/>
-          <w:sz w:val="24"/>
-          <w:szCs w:val="24"/>
-        </w:rPr>
-        <w:t>price &gt; 45000;</w:t>
-      </w:r>
-    </w:p>
-    <w:p>
-      <w:pPr>
-        <w:pStyle w:val="ListParagraph"/>
-        <w:ind w:left="1440"/>
-        <w:jc w:val="both"/>
-        <w:rPr>
-          <w:rFonts w:ascii="Times New Roman" w:hAnsi="Times New Roman" w:cs="Times New Roman"/>
-          <w:sz w:val="24"/>
-          <w:szCs w:val="24"/>
-        </w:rPr>
-      </w:pPr>
-    </w:p>
-    <w:p>
-      <w:pPr>
-        <w:pStyle w:val="ListParagraph"/>
-        <w:numPr>
-          <w:ilvl w:val="1"/>
-          <w:numId w:val="18"/>
-        </w:numPr>
-        <w:jc w:val="both"/>
-        <w:rPr>
-          <w:rFonts w:ascii="Times New Roman" w:hAnsi="Times New Roman" w:cs="Times New Roman"/>
-          <w:sz w:val="28"/>
-          <w:szCs w:val="28"/>
-        </w:rPr>
-      </w:pPr>
-      <w:r>
-        <w:rPr>
-          <w:rFonts w:ascii="Times New Roman" w:hAnsi="Times New Roman" w:cs="Times New Roman"/>
-          <w:sz w:val="28"/>
-          <w:szCs w:val="28"/>
-        </w:rPr>
-        <w:t>Sorting Query Results:</w:t>
-      </w:r>
-    </w:p>
-    <w:p>
-      <w:pPr>
-        <w:pStyle w:val="ListParagraph"/>
-        <w:numPr>
-          <w:ilvl w:val="2"/>
-          <w:numId w:val="18"/>
-        </w:numPr>
-        <w:jc w:val="both"/>
-        <w:rPr>
-          <w:rFonts w:ascii="Times New Roman" w:hAnsi="Times New Roman" w:cs="Times New Roman"/>
-          <w:sz w:val="28"/>
-          <w:szCs w:val="28"/>
-        </w:rPr>
-      </w:pPr>
-      <w:r>
-        <w:rPr>
-          <w:rFonts w:ascii="Times New Roman" w:hAnsi="Times New Roman" w:cs="Times New Roman"/>
-          <w:sz w:val="28"/>
-          <w:szCs w:val="28"/>
-        </w:rPr>
-        <w:t xml:space="preserve">Sorting in descending order: </w:t>
-      </w:r>
-      <w:r>
-        <w:rPr>
-          <w:rFonts w:ascii="Times New Roman" w:hAnsi="Times New Roman" w:cs="Times New Roman"/>
-          <w:sz w:val="28"/>
-          <w:szCs w:val="28"/>
-        </w:rPr>
-        <w:br/>
-      </w:r>
-      <w:r>
-        <w:rPr>
-          <w:rFonts w:ascii="Times New Roman" w:hAnsi="Times New Roman" w:cs="Times New Roman"/>
-          <w:sz w:val="24"/>
-          <w:szCs w:val="24"/>
-        </w:rPr>
-        <w:t>S</w:t>
-      </w:r>
-      <w:r>
-        <w:rPr>
-          <w:rFonts w:ascii="Times New Roman" w:hAnsi="Times New Roman" w:cs="Times New Roman"/>
-          <w:sz w:val="24"/>
-          <w:szCs w:val="24"/>
-        </w:rPr>
-        <w:t>elect</w:t>
-      </w:r>
-      <w:r>
-        <w:rPr>
-          <w:rFonts w:ascii="Times New Roman" w:hAnsi="Times New Roman" w:cs="Times New Roman"/>
-          <w:sz w:val="24"/>
-          <w:szCs w:val="24"/>
-        </w:rPr>
-        <w:t xml:space="preserve"> </w:t>
-      </w:r>
-      <w:r>
-        <w:rPr>
-          <w:rFonts w:ascii="Times New Roman" w:hAnsi="Times New Roman" w:cs="Times New Roman"/>
-          <w:sz w:val="24"/>
-          <w:szCs w:val="24"/>
-        </w:rPr>
-        <w:t>order_id,</w:t>
-      </w:r>
-      <w:r>
-        <w:rPr>
-          <w:rFonts w:ascii="Times New Roman" w:hAnsi="Times New Roman" w:cs="Times New Roman"/>
-          <w:sz w:val="24"/>
-          <w:szCs w:val="24"/>
-        </w:rPr>
-        <w:t xml:space="preserve"> </w:t>
-      </w:r>
-      <w:r>
-        <w:rPr>
-          <w:rFonts w:ascii="Times New Roman" w:hAnsi="Times New Roman" w:cs="Times New Roman"/>
-          <w:sz w:val="24"/>
-          <w:szCs w:val="24"/>
-        </w:rPr>
-        <w:t>customer_name as name,</w:t>
-      </w:r>
-      <w:r>
-        <w:rPr>
-          <w:rFonts w:ascii="Times New Roman" w:hAnsi="Times New Roman" w:cs="Times New Roman"/>
-          <w:sz w:val="24"/>
-          <w:szCs w:val="24"/>
-        </w:rPr>
-        <w:t xml:space="preserve"> </w:t>
-      </w:r>
-      <w:r>
-        <w:rPr>
-          <w:rFonts w:ascii="Times New Roman" w:hAnsi="Times New Roman" w:cs="Times New Roman"/>
-          <w:sz w:val="24"/>
-          <w:szCs w:val="24"/>
-        </w:rPr>
-        <w:t>price as shopping_value</w:t>
-      </w:r>
-      <w:r>
-        <w:rPr>
-          <w:rFonts w:ascii="Times New Roman" w:hAnsi="Times New Roman" w:cs="Times New Roman"/>
-          <w:sz w:val="24"/>
-          <w:szCs w:val="24"/>
-        </w:rPr>
-        <w:t xml:space="preserve"> </w:t>
-      </w:r>
-      <w:r>
-        <w:rPr>
-          <w:rFonts w:ascii="Times New Roman" w:hAnsi="Times New Roman" w:cs="Times New Roman"/>
-          <w:sz w:val="24"/>
-          <w:szCs w:val="24"/>
-        </w:rPr>
-        <w:t>from</w:t>
-      </w:r>
-      <w:r>
-        <w:rPr>
-          <w:rFonts w:ascii="Times New Roman" w:hAnsi="Times New Roman" w:cs="Times New Roman"/>
-          <w:sz w:val="24"/>
-          <w:szCs w:val="24"/>
-        </w:rPr>
-        <w:t xml:space="preserve"> </w:t>
-      </w:r>
-      <w:r>
-        <w:rPr>
-          <w:rFonts w:ascii="Times New Roman" w:hAnsi="Times New Roman" w:cs="Times New Roman"/>
-          <w:sz w:val="24"/>
-          <w:szCs w:val="24"/>
-        </w:rPr>
-        <w:t>customer_orders</w:t>
-      </w:r>
-      <w:r>
-        <w:rPr>
-          <w:rFonts w:ascii="Times New Roman" w:hAnsi="Times New Roman" w:cs="Times New Roman"/>
-          <w:sz w:val="24"/>
-          <w:szCs w:val="24"/>
-        </w:rPr>
-        <w:t xml:space="preserve"> </w:t>
-      </w:r>
-      <w:r>
-        <w:rPr>
-          <w:rFonts w:ascii="Times New Roman" w:hAnsi="Times New Roman" w:cs="Times New Roman"/>
-          <w:sz w:val="24"/>
-          <w:szCs w:val="24"/>
-        </w:rPr>
-        <w:t>order by</w:t>
-      </w:r>
-      <w:r>
-        <w:rPr>
-          <w:rFonts w:ascii="Times New Roman" w:hAnsi="Times New Roman" w:cs="Times New Roman"/>
-          <w:sz w:val="24"/>
-          <w:szCs w:val="24"/>
-        </w:rPr>
-        <w:t xml:space="preserve"> </w:t>
-      </w:r>
-      <w:r>
-        <w:rPr>
-          <w:rFonts w:ascii="Times New Roman" w:hAnsi="Times New Roman" w:cs="Times New Roman"/>
-          <w:sz w:val="24"/>
-          <w:szCs w:val="24"/>
-        </w:rPr>
-        <w:t>shopping_value desc</w:t>
-      </w:r>
-      <w:r>
-        <w:rPr>
-          <w:rFonts w:ascii="Times New Roman" w:hAnsi="Times New Roman" w:cs="Times New Roman"/>
-          <w:sz w:val="24"/>
-          <w:szCs w:val="24"/>
-        </w:rPr>
-        <w:t>;</w:t>
-      </w:r>
-    </w:p>
-    <w:p>
-      <w:pPr>
-        <w:pStyle w:val="ListParagraph"/>
-        <w:ind w:left="1440"/>
-        <w:jc w:val="both"/>
-        <w:rPr>
-          <w:rFonts w:ascii="Times New Roman" w:hAnsi="Times New Roman" w:cs="Times New Roman"/>
-          <w:sz w:val="28"/>
-          <w:szCs w:val="28"/>
-        </w:rPr>
-      </w:pPr>
-    </w:p>
-    <w:p>
-      <w:pPr>
-        <w:pStyle w:val="ListParagraph"/>
-        <w:ind w:left="1440"/>
-        <w:jc w:val="both"/>
-        <w:rPr>
-          <w:rFonts w:ascii="Times New Roman" w:hAnsi="Times New Roman" w:cs="Times New Roman"/>
-          <w:sz w:val="28"/>
-          <w:szCs w:val="28"/>
-        </w:rPr>
-      </w:pPr>
-    </w:p>
-    <w:p>
-      <w:pPr>
-        <w:pStyle w:val="ListParagraph"/>
-        <w:numPr>
-          <w:ilvl w:val="2"/>
-          <w:numId w:val="18"/>
-        </w:numPr>
-        <w:jc w:val="both"/>
-        <w:rPr>
-          <w:rFonts w:ascii="Times New Roman" w:hAnsi="Times New Roman" w:cs="Times New Roman"/>
-          <w:sz w:val="24"/>
-          <w:szCs w:val="24"/>
-        </w:rPr>
-      </w:pPr>
-      <w:r>
-        <w:rPr>
-          <w:rFonts w:ascii="Times New Roman" w:hAnsi="Times New Roman" w:cs="Times New Roman"/>
-          <w:sz w:val="28"/>
-          <w:szCs w:val="28"/>
-        </w:rPr>
-        <w:lastRenderedPageBreak/>
-        <w:t xml:space="preserve">Priority based sorting: </w:t>
-      </w:r>
-      <w:r>
-        <w:rPr>
-          <w:rFonts w:ascii="Times New Roman" w:hAnsi="Times New Roman" w:cs="Times New Roman"/>
-          <w:sz w:val="28"/>
-          <w:szCs w:val="28"/>
-        </w:rPr>
-        <w:br/>
-      </w:r>
-      <w:r>
-        <w:rPr>
-          <w:rFonts w:ascii="Times New Roman" w:hAnsi="Times New Roman" w:cs="Times New Roman"/>
-          <w:sz w:val="24"/>
-          <w:szCs w:val="24"/>
-        </w:rPr>
-        <w:t>S</w:t>
-      </w:r>
-      <w:r>
-        <w:rPr>
-          <w:rFonts w:ascii="Times New Roman" w:hAnsi="Times New Roman" w:cs="Times New Roman"/>
-          <w:sz w:val="24"/>
-          <w:szCs w:val="24"/>
-        </w:rPr>
-        <w:t>elect</w:t>
-      </w:r>
-      <w:r>
-        <w:rPr>
-          <w:rFonts w:ascii="Times New Roman" w:hAnsi="Times New Roman" w:cs="Times New Roman"/>
-          <w:sz w:val="24"/>
-          <w:szCs w:val="24"/>
-        </w:rPr>
-        <w:t xml:space="preserve"> </w:t>
-      </w:r>
-      <w:r>
-        <w:rPr>
-          <w:rFonts w:ascii="Times New Roman" w:hAnsi="Times New Roman" w:cs="Times New Roman"/>
-          <w:sz w:val="24"/>
-          <w:szCs w:val="24"/>
-        </w:rPr>
-        <w:t>order_id,</w:t>
-      </w:r>
-      <w:r>
-        <w:rPr>
-          <w:rFonts w:ascii="Times New Roman" w:hAnsi="Times New Roman" w:cs="Times New Roman"/>
-          <w:sz w:val="24"/>
-          <w:szCs w:val="24"/>
-        </w:rPr>
-        <w:t xml:space="preserve"> </w:t>
-      </w:r>
-      <w:r>
-        <w:rPr>
-          <w:rFonts w:ascii="Times New Roman" w:hAnsi="Times New Roman" w:cs="Times New Roman"/>
-          <w:sz w:val="24"/>
-          <w:szCs w:val="24"/>
-        </w:rPr>
-        <w:t>customer_name as name,</w:t>
-      </w:r>
-      <w:r>
-        <w:rPr>
-          <w:rFonts w:ascii="Times New Roman" w:hAnsi="Times New Roman" w:cs="Times New Roman"/>
-          <w:sz w:val="24"/>
-          <w:szCs w:val="24"/>
-        </w:rPr>
-        <w:t xml:space="preserve"> </w:t>
-      </w:r>
-      <w:r>
-        <w:rPr>
-          <w:rFonts w:ascii="Times New Roman" w:hAnsi="Times New Roman" w:cs="Times New Roman"/>
-          <w:sz w:val="24"/>
-          <w:szCs w:val="24"/>
-        </w:rPr>
-        <w:t>price as shopping_value</w:t>
-      </w:r>
-      <w:r>
-        <w:rPr>
-          <w:rFonts w:ascii="Times New Roman" w:hAnsi="Times New Roman" w:cs="Times New Roman"/>
-          <w:sz w:val="24"/>
-          <w:szCs w:val="24"/>
-        </w:rPr>
-        <w:t xml:space="preserve"> </w:t>
-      </w:r>
-      <w:r>
-        <w:rPr>
-          <w:rFonts w:ascii="Times New Roman" w:hAnsi="Times New Roman" w:cs="Times New Roman"/>
-          <w:sz w:val="24"/>
-          <w:szCs w:val="24"/>
-        </w:rPr>
-        <w:t>from</w:t>
-      </w:r>
-      <w:r>
-        <w:rPr>
-          <w:rFonts w:ascii="Times New Roman" w:hAnsi="Times New Roman" w:cs="Times New Roman"/>
-          <w:sz w:val="24"/>
-          <w:szCs w:val="24"/>
-        </w:rPr>
-        <w:t xml:space="preserve"> </w:t>
-      </w:r>
-      <w:r>
-        <w:rPr>
-          <w:rFonts w:ascii="Times New Roman" w:hAnsi="Times New Roman" w:cs="Times New Roman"/>
-          <w:sz w:val="24"/>
-          <w:szCs w:val="24"/>
-        </w:rPr>
-        <w:t>customer_orders</w:t>
-      </w:r>
-      <w:r>
-        <w:rPr>
-          <w:rFonts w:ascii="Times New Roman" w:hAnsi="Times New Roman" w:cs="Times New Roman"/>
-          <w:sz w:val="24"/>
-          <w:szCs w:val="24"/>
-        </w:rPr>
-        <w:t xml:space="preserve"> </w:t>
-      </w:r>
-      <w:r>
-        <w:rPr>
-          <w:rFonts w:ascii="Times New Roman" w:hAnsi="Times New Roman" w:cs="Times New Roman"/>
-          <w:sz w:val="24"/>
-          <w:szCs w:val="24"/>
-        </w:rPr>
-        <w:t>order by</w:t>
-      </w:r>
-      <w:r>
-        <w:rPr>
-          <w:rFonts w:ascii="Times New Roman" w:hAnsi="Times New Roman" w:cs="Times New Roman"/>
-          <w:sz w:val="24"/>
-          <w:szCs w:val="24"/>
-        </w:rPr>
-        <w:t xml:space="preserve"> </w:t>
-      </w:r>
-      <w:r>
-        <w:rPr>
-          <w:rFonts w:ascii="Times New Roman" w:hAnsi="Times New Roman" w:cs="Times New Roman"/>
-          <w:sz w:val="24"/>
-          <w:szCs w:val="24"/>
-        </w:rPr>
-        <w:t>shopping_value desc,</w:t>
-      </w:r>
-      <w:r>
-        <w:rPr>
-          <w:rFonts w:ascii="Times New Roman" w:hAnsi="Times New Roman" w:cs="Times New Roman"/>
-          <w:sz w:val="24"/>
-          <w:szCs w:val="24"/>
-        </w:rPr>
-        <w:t xml:space="preserve"> </w:t>
-      </w:r>
-      <w:r>
-        <w:rPr>
-          <w:rFonts w:ascii="Times New Roman" w:hAnsi="Times New Roman" w:cs="Times New Roman"/>
-          <w:sz w:val="24"/>
-          <w:szCs w:val="24"/>
-        </w:rPr>
-        <w:t>order_id;</w:t>
-      </w:r>
-    </w:p>
-    <w:p>
-      <w:pPr>
-        <w:pStyle w:val="ListParagraph"/>
-        <w:rPr>
-          <w:rFonts w:ascii="Times New Roman" w:hAnsi="Times New Roman" w:cs="Times New Roman"/>
-          <w:sz w:val="24"/>
-          <w:szCs w:val="24"/>
-        </w:rPr>
-      </w:pPr>
-    </w:p>
-    <w:p>
-      <w:pPr>
-        <w:pStyle w:val="ListParagraph"/>
-        <w:numPr>
-          <w:ilvl w:val="1"/>
-          <w:numId w:val="18"/>
-        </w:numPr>
-        <w:jc w:val="both"/>
-        <w:rPr>
-          <w:rFonts w:ascii="Times New Roman" w:hAnsi="Times New Roman" w:cs="Times New Roman"/>
-          <w:sz w:val="24"/>
-          <w:szCs w:val="24"/>
-        </w:rPr>
-      </w:pPr>
-      <w:r>
-        <w:rPr>
-          <w:rFonts w:ascii="Times New Roman" w:hAnsi="Times New Roman" w:cs="Times New Roman"/>
-          <w:sz w:val="28"/>
-          <w:szCs w:val="28"/>
-        </w:rPr>
-        <w:t>Grouping data for aggregation:</w:t>
-      </w:r>
-    </w:p>
-    <w:p>
-      <w:pPr>
-        <w:pStyle w:val="ListParagraph"/>
-        <w:numPr>
-          <w:ilvl w:val="2"/>
-          <w:numId w:val="18"/>
-        </w:numPr>
-        <w:jc w:val="both"/>
-        <w:rPr>
-          <w:rFonts w:ascii="Times New Roman" w:hAnsi="Times New Roman" w:cs="Times New Roman"/>
-          <w:sz w:val="24"/>
-          <w:szCs w:val="24"/>
-        </w:rPr>
-      </w:pPr>
-      <w:r>
-        <w:rPr>
-          <w:rFonts w:ascii="Times New Roman" w:hAnsi="Times New Roman" w:cs="Times New Roman"/>
-          <w:sz w:val="24"/>
-          <w:szCs w:val="24"/>
-        </w:rPr>
-        <w:t>Select</w:t>
-      </w:r>
-      <w:r>
-        <w:rPr>
-          <w:rFonts w:ascii="Times New Roman" w:hAnsi="Times New Roman" w:cs="Times New Roman"/>
-          <w:sz w:val="24"/>
-          <w:szCs w:val="24"/>
-        </w:rPr>
-        <w:t xml:space="preserve"> </w:t>
-      </w:r>
-      <w:r>
-        <w:rPr>
-          <w:rFonts w:ascii="Times New Roman" w:hAnsi="Times New Roman" w:cs="Times New Roman"/>
-          <w:sz w:val="24"/>
-          <w:szCs w:val="24"/>
-        </w:rPr>
-        <w:t>product,</w:t>
-      </w:r>
-      <w:r>
-        <w:rPr>
-          <w:rFonts w:ascii="Times New Roman" w:hAnsi="Times New Roman" w:cs="Times New Roman"/>
-          <w:sz w:val="24"/>
-          <w:szCs w:val="24"/>
-        </w:rPr>
-        <w:t xml:space="preserve"> </w:t>
-      </w:r>
-      <w:r>
-        <w:rPr>
-          <w:rFonts w:ascii="Times New Roman" w:hAnsi="Times New Roman" w:cs="Times New Roman"/>
-          <w:sz w:val="24"/>
-          <w:szCs w:val="24"/>
-        </w:rPr>
-        <w:t>count(product) as quantity_sold,</w:t>
-      </w:r>
-      <w:r>
-        <w:rPr>
-          <w:rFonts w:ascii="Times New Roman" w:hAnsi="Times New Roman" w:cs="Times New Roman"/>
-          <w:sz w:val="24"/>
-          <w:szCs w:val="24"/>
-        </w:rPr>
-        <w:t xml:space="preserve"> </w:t>
-      </w:r>
-      <w:r>
-        <w:rPr>
-          <w:rFonts w:ascii="Times New Roman" w:hAnsi="Times New Roman" w:cs="Times New Roman"/>
-          <w:sz w:val="24"/>
-          <w:szCs w:val="24"/>
-        </w:rPr>
-        <w:t>sum(quantity * price) as total_sales</w:t>
-      </w:r>
-      <w:r>
-        <w:rPr>
-          <w:rFonts w:ascii="Times New Roman" w:hAnsi="Times New Roman" w:cs="Times New Roman"/>
-          <w:sz w:val="24"/>
-          <w:szCs w:val="24"/>
-        </w:rPr>
-        <w:t xml:space="preserve"> </w:t>
-      </w:r>
-      <w:r>
-        <w:rPr>
-          <w:rFonts w:ascii="Times New Roman" w:hAnsi="Times New Roman" w:cs="Times New Roman"/>
-          <w:sz w:val="24"/>
-          <w:szCs w:val="24"/>
-        </w:rPr>
-        <w:t>from</w:t>
-      </w:r>
-      <w:r>
-        <w:rPr>
-          <w:rFonts w:ascii="Times New Roman" w:hAnsi="Times New Roman" w:cs="Times New Roman"/>
-          <w:sz w:val="24"/>
-          <w:szCs w:val="24"/>
-        </w:rPr>
-        <w:t xml:space="preserve"> </w:t>
-      </w:r>
-      <w:r>
-        <w:rPr>
-          <w:rFonts w:ascii="Times New Roman" w:hAnsi="Times New Roman" w:cs="Times New Roman"/>
-          <w:sz w:val="24"/>
-          <w:szCs w:val="24"/>
-        </w:rPr>
-        <w:t>customer_orders</w:t>
-      </w:r>
-      <w:r>
-        <w:rPr>
-          <w:rFonts w:ascii="Times New Roman" w:hAnsi="Times New Roman" w:cs="Times New Roman"/>
-          <w:sz w:val="24"/>
-          <w:szCs w:val="24"/>
-        </w:rPr>
-        <w:t xml:space="preserve"> </w:t>
-      </w:r>
-      <w:r>
-        <w:rPr>
-          <w:rFonts w:ascii="Times New Roman" w:hAnsi="Times New Roman" w:cs="Times New Roman"/>
-          <w:sz w:val="24"/>
-          <w:szCs w:val="24"/>
-        </w:rPr>
-        <w:t>group by</w:t>
-      </w:r>
-      <w:r>
-        <w:rPr>
-          <w:rFonts w:ascii="Times New Roman" w:hAnsi="Times New Roman" w:cs="Times New Roman"/>
-          <w:sz w:val="24"/>
-          <w:szCs w:val="24"/>
-        </w:rPr>
-        <w:t xml:space="preserve"> </w:t>
-      </w:r>
-      <w:r>
-        <w:rPr>
-          <w:rFonts w:ascii="Times New Roman" w:hAnsi="Times New Roman" w:cs="Times New Roman"/>
-          <w:sz w:val="24"/>
-          <w:szCs w:val="24"/>
-        </w:rPr>
-        <w:t>product;</w:t>
-      </w:r>
-    </w:p>
-    <w:p>
-      <w:pPr>
-        <w:pStyle w:val="ListParagraph"/>
-        <w:jc w:val="both"/>
-        <w:rPr>
-          <w:rFonts w:ascii="Times New Roman" w:hAnsi="Times New Roman" w:cs="Times New Roman"/>
-          <w:sz w:val="24"/>
-          <w:szCs w:val="24"/>
-        </w:rPr>
-      </w:pPr>
-    </w:p>
-    <w:p>
-      <w:pPr>
-        <w:pStyle w:val="ListParagraph"/>
-        <w:numPr>
-          <w:ilvl w:val="1"/>
-          <w:numId w:val="18"/>
-        </w:numPr>
-        <w:jc w:val="both"/>
-        <w:rPr>
-          <w:rFonts w:ascii="Times New Roman" w:hAnsi="Times New Roman" w:cs="Times New Roman"/>
-          <w:sz w:val="28"/>
-          <w:szCs w:val="28"/>
-        </w:rPr>
-      </w:pPr>
-      <w:r>
-        <w:rPr>
-          <w:rFonts w:ascii="Times New Roman" w:hAnsi="Times New Roman" w:cs="Times New Roman"/>
-          <w:sz w:val="28"/>
-          <w:szCs w:val="28"/>
-        </w:rPr>
-        <w:t>Applying conditions on aggregate data:</w:t>
-      </w:r>
-    </w:p>
-    <w:p>
-      <w:pPr>
-        <w:pStyle w:val="ListParagraph"/>
-        <w:numPr>
-          <w:ilvl w:val="2"/>
-          <w:numId w:val="18"/>
-        </w:numPr>
-        <w:jc w:val="both"/>
-        <w:rPr>
-          <w:rFonts w:ascii="Times New Roman" w:hAnsi="Times New Roman" w:cs="Times New Roman"/>
-          <w:sz w:val="24"/>
-          <w:szCs w:val="24"/>
-        </w:rPr>
-      </w:pPr>
-      <w:r>
-        <w:rPr>
-          <w:rFonts w:ascii="Times New Roman" w:hAnsi="Times New Roman" w:cs="Times New Roman"/>
-          <w:sz w:val="24"/>
-          <w:szCs w:val="24"/>
-        </w:rPr>
-        <w:t>Select</w:t>
-      </w:r>
-      <w:r>
-        <w:rPr>
-          <w:rFonts w:ascii="Times New Roman" w:hAnsi="Times New Roman" w:cs="Times New Roman"/>
-          <w:sz w:val="24"/>
-          <w:szCs w:val="24"/>
-        </w:rPr>
-        <w:t xml:space="preserve"> </w:t>
-      </w:r>
-      <w:r>
-        <w:rPr>
-          <w:rFonts w:ascii="Times New Roman" w:hAnsi="Times New Roman" w:cs="Times New Roman"/>
-          <w:sz w:val="24"/>
-          <w:szCs w:val="24"/>
-        </w:rPr>
-        <w:t>product,</w:t>
-      </w:r>
-      <w:r>
-        <w:rPr>
-          <w:rFonts w:ascii="Times New Roman" w:hAnsi="Times New Roman" w:cs="Times New Roman"/>
-          <w:sz w:val="24"/>
-          <w:szCs w:val="24"/>
-        </w:rPr>
-        <w:t xml:space="preserve"> </w:t>
-      </w:r>
-      <w:r>
-        <w:rPr>
-          <w:rFonts w:ascii="Times New Roman" w:hAnsi="Times New Roman" w:cs="Times New Roman"/>
-          <w:sz w:val="24"/>
-          <w:szCs w:val="24"/>
-        </w:rPr>
-        <w:t>sum(quantity) as quantity_sold,</w:t>
-      </w:r>
-      <w:r>
-        <w:rPr>
-          <w:rFonts w:ascii="Times New Roman" w:hAnsi="Times New Roman" w:cs="Times New Roman"/>
-          <w:sz w:val="24"/>
-          <w:szCs w:val="24"/>
-        </w:rPr>
-        <w:t xml:space="preserve"> </w:t>
-      </w:r>
-      <w:r>
-        <w:rPr>
-          <w:rFonts w:ascii="Times New Roman" w:hAnsi="Times New Roman" w:cs="Times New Roman"/>
-          <w:sz w:val="24"/>
-          <w:szCs w:val="24"/>
-        </w:rPr>
-        <w:t>sum(quantity * price) as total_sales</w:t>
-      </w:r>
-      <w:r>
-        <w:rPr>
-          <w:rFonts w:ascii="Times New Roman" w:hAnsi="Times New Roman" w:cs="Times New Roman"/>
-          <w:sz w:val="24"/>
-          <w:szCs w:val="24"/>
-        </w:rPr>
-        <w:t xml:space="preserve"> </w:t>
-      </w:r>
-      <w:r>
-        <w:rPr>
-          <w:rFonts w:ascii="Times New Roman" w:hAnsi="Times New Roman" w:cs="Times New Roman"/>
-          <w:sz w:val="24"/>
-          <w:szCs w:val="24"/>
-        </w:rPr>
-        <w:t>from</w:t>
-      </w:r>
-      <w:r>
-        <w:rPr>
-          <w:rFonts w:ascii="Times New Roman" w:hAnsi="Times New Roman" w:cs="Times New Roman"/>
-          <w:sz w:val="24"/>
-          <w:szCs w:val="24"/>
-        </w:rPr>
-        <w:t xml:space="preserve"> </w:t>
-      </w:r>
-      <w:r>
-        <w:rPr>
-          <w:rFonts w:ascii="Times New Roman" w:hAnsi="Times New Roman" w:cs="Times New Roman"/>
-          <w:sz w:val="24"/>
-          <w:szCs w:val="24"/>
-        </w:rPr>
-        <w:t>customer_orders</w:t>
-      </w:r>
-      <w:r>
-        <w:rPr>
-          <w:rFonts w:ascii="Times New Roman" w:hAnsi="Times New Roman" w:cs="Times New Roman"/>
-          <w:sz w:val="24"/>
-          <w:szCs w:val="24"/>
-        </w:rPr>
-        <w:t xml:space="preserve"> </w:t>
-      </w:r>
-      <w:r>
-        <w:rPr>
-          <w:rFonts w:ascii="Times New Roman" w:hAnsi="Times New Roman" w:cs="Times New Roman"/>
-          <w:sz w:val="24"/>
-          <w:szCs w:val="24"/>
-        </w:rPr>
-        <w:t>group by</w:t>
-      </w:r>
-      <w:r>
-        <w:rPr>
-          <w:rFonts w:ascii="Times New Roman" w:hAnsi="Times New Roman" w:cs="Times New Roman"/>
-          <w:sz w:val="24"/>
-          <w:szCs w:val="24"/>
-        </w:rPr>
-        <w:t xml:space="preserve"> </w:t>
-      </w:r>
-      <w:r>
-        <w:rPr>
-          <w:rFonts w:ascii="Times New Roman" w:hAnsi="Times New Roman" w:cs="Times New Roman"/>
-          <w:sz w:val="24"/>
-          <w:szCs w:val="24"/>
-        </w:rPr>
-        <w:t>product</w:t>
-      </w:r>
-      <w:r>
-        <w:rPr>
-          <w:rFonts w:ascii="Times New Roman" w:hAnsi="Times New Roman" w:cs="Times New Roman"/>
-          <w:sz w:val="24"/>
-          <w:szCs w:val="24"/>
-        </w:rPr>
-        <w:t xml:space="preserve"> </w:t>
-      </w:r>
-      <w:r>
-        <w:rPr>
-          <w:rFonts w:ascii="Times New Roman" w:hAnsi="Times New Roman" w:cs="Times New Roman"/>
-          <w:sz w:val="24"/>
-          <w:szCs w:val="24"/>
-        </w:rPr>
-        <w:t>having</w:t>
-      </w:r>
-      <w:r>
-        <w:rPr>
-          <w:rFonts w:ascii="Times New Roman" w:hAnsi="Times New Roman" w:cs="Times New Roman"/>
-          <w:sz w:val="24"/>
-          <w:szCs w:val="24"/>
-        </w:rPr>
-        <w:t xml:space="preserve"> </w:t>
-      </w:r>
-      <w:r>
-        <w:rPr>
-          <w:rFonts w:ascii="Times New Roman" w:hAnsi="Times New Roman" w:cs="Times New Roman"/>
-          <w:sz w:val="24"/>
-          <w:szCs w:val="24"/>
-        </w:rPr>
-        <w:t>sum(quantity) &gt;= 5</w:t>
-      </w:r>
-      <w:r>
-        <w:rPr>
-          <w:rFonts w:ascii="Times New Roman" w:hAnsi="Times New Roman" w:cs="Times New Roman"/>
-          <w:sz w:val="24"/>
-          <w:szCs w:val="24"/>
-        </w:rPr>
-        <w:t>;</w:t>
-      </w:r>
-    </w:p>
-    <w:p>
-      <w:pPr>
-        <w:pStyle w:val="ListParagraph"/>
-        <w:jc w:val="both"/>
-        <w:rPr>
-          <w:rFonts w:ascii="Times New Roman" w:hAnsi="Times New Roman" w:cs="Times New Roman"/>
-          <w:sz w:val="24"/>
-          <w:szCs w:val="24"/>
-        </w:rPr>
-      </w:pPr>
-    </w:p>
-    <w:p>
-      <w:pPr>
-        <w:pStyle w:val="ListParagraph"/>
-        <w:numPr>
-          <w:ilvl w:val="0"/>
-          <w:numId w:val="18"/>
-        </w:numPr>
-        <w:jc w:val="both"/>
-        <w:rPr>
-          <w:rFonts w:ascii="Times New Roman" w:hAnsi="Times New Roman" w:cs="Times New Roman"/>
-          <w:b/>
-          <w:bCs/>
-          <w:sz w:val="28"/>
-          <w:szCs w:val="28"/>
-        </w:rPr>
-      </w:pPr>
-      <w:r>
-        <w:rPr>
-          <w:rFonts w:ascii="Times New Roman" w:hAnsi="Times New Roman" w:cs="Times New Roman"/>
-          <w:b/>
-          <w:bCs/>
-          <w:sz w:val="28"/>
-          <w:szCs w:val="28"/>
-        </w:rPr>
-        <w:t>Output</w:t>
-      </w:r>
-    </w:p>
-    <w:p>
-      <w:pPr>
-        <w:pStyle w:val="ListParagraph"/>
-        <w:numPr>
-          <w:ilvl w:val="1"/>
-          <w:numId w:val="18"/>
-        </w:numPr>
-        <w:jc w:val="both"/>
-        <w:rPr>
-          <w:rFonts w:ascii="Times New Roman" w:hAnsi="Times New Roman" w:cs="Times New Roman"/>
-          <w:b/>
-          <w:bCs/>
-          <w:sz w:val="28"/>
-          <w:szCs w:val="28"/>
-        </w:rPr>
-      </w:pPr>
-      <w:r>
-        <w:rPr>
-          <w:rFonts w:ascii="Times New Roman" w:hAnsi="Times New Roman" w:cs="Times New Roman"/>
-          <w:sz w:val="28"/>
-          <w:szCs w:val="28"/>
-        </w:rPr>
-        <w:t>Filtering data using conditions:</w:t>
-      </w:r>
-      <w:r>
-        <w:rPr>
-          <w:rFonts w:ascii="Times New Roman" w:hAnsi="Times New Roman" w:cs="Times New Roman"/>
-          <w:b/>
-          <w:bCs/>
+        <w:ind w:left="2160"/>
+        <w:jc w:val="both"/>
+        <w:rPr>
+          <w:rFonts w:ascii="Times New Roman" w:hAnsi="Times New Roman" w:cs="Times New Roman"/>
+          <w:sz w:val="28"/>
+          <w:szCs w:val="28"/>
+        </w:rPr>
+      </w:pPr>
+      <w:r>
+        <w:rPr>
+          <w:rFonts w:ascii="Times New Roman" w:hAnsi="Times New Roman" w:cs="Times New Roman"/>
           <w:noProof/>
-          <w:sz w:val="28"/>
-          <w:szCs w:val="28"/>
-        </w:rPr>
-        <w:t xml:space="preserve"> </w:t>
-      </w:r>
-    </w:p>
-    <w:p>
-      <w:pPr>
-        <w:pStyle w:val="ListParagraph"/>
-        <w:ind w:left="1440"/>
-        <w:jc w:val="both"/>
-        <w:rPr>
-          <w:rFonts w:ascii="Times New Roman" w:hAnsi="Times New Roman" w:cs="Times New Roman"/>
-          <w:b/>
-          <w:bCs/>
-          <w:sz w:val="28"/>
-          <w:szCs w:val="28"/>
-        </w:rPr>
-      </w:pPr>
-      <w:r>
-        <w:rPr>
-          <w:rFonts w:ascii="Times New Roman" w:hAnsi="Times New Roman" w:cs="Times New Roman"/>
-          <w:b/>
-          <w:bCs/>
-          <w:noProof/>
-          <w:sz w:val="28"/>
-          <w:szCs w:val="28"/>
+          <w:sz w:val="24"/>
+          <w:szCs w:val="24"/>
         </w:rPr>
         <w:drawing>
-          <wp:inline distT="0" distB="0" distL="0" distR="0" wp14:anchorId="7AC5B134" wp14:editId="6024C163">
-            <wp:extent cx="5683019" cy="950247"/>
-            <wp:effectExtent l="0" t="0" r="0" b="2540"/>
-            <wp:docPr id="1373699497" name="Picture 2"/>
+          <wp:inline distT="0" distB="0" distL="0" distR="0" wp14:anchorId="7A0C4CDB" wp14:editId="286661C6">
+            <wp:extent cx="5205730" cy="2171700"/>
+            <wp:effectExtent l="0" t="0" r="0" b="0"/>
+            <wp:docPr id="935946294" name="Picture 1"/>
             <wp:cNvGraphicFramePr>
               <a:graphicFrameLocks xmlns:a="http://schemas.openxmlformats.org/drawingml/2006/main" noChangeAspect="1"/>
             </wp:cNvGraphicFramePr>
@@ -1921,10 +1466,12 @@
               <a:graphicData uri="http://schemas.openxmlformats.org/drawingml/2006/picture">
                 <pic:pic xmlns:pic="http://schemas.openxmlformats.org/drawingml/2006/picture">
                   <pic:nvPicPr>
-                    <pic:cNvPr id="1373699497" name="Picture 1373699497"/>
-                    <pic:cNvPicPr/>
+                    <pic:cNvPr id="0" name="Picture 1"/>
+                    <pic:cNvPicPr>
+                      <a:picLocks noChangeAspect="1" noChangeArrowheads="1"/>
+                    </pic:cNvPicPr>
                   </pic:nvPicPr>
-                  <pic:blipFill>
+                  <pic:blipFill rotWithShape="1">
                     <a:blip r:embed="rId8">
                       <a:extLst>
                         <a:ext uri="{28A0092B-C50C-407E-A947-70E740481C1C}">
@@ -1932,111 +1479,7 @@
                         </a:ext>
                       </a:extLst>
                     </a:blip>
-                    <a:stretch>
-                      <a:fillRect/>
-                    </a:stretch>
-                  </pic:blipFill>
-                  <pic:spPr>
-                    <a:xfrm>
-                      <a:off x="0" y="0"/>
-                      <a:ext cx="5736292" cy="959155"/>
-                    </a:xfrm>
-                    <a:prstGeom prst="rect">
-                      <a:avLst/>
-                    </a:prstGeom>
-                  </pic:spPr>
-                </pic:pic>
-              </a:graphicData>
-            </a:graphic>
-          </wp:inline>
-        </w:drawing>
-      </w:r>
-    </w:p>
-    <w:p>
-      <w:pPr>
-        <w:pStyle w:val="ListParagraph"/>
-        <w:ind w:left="1440"/>
-        <w:jc w:val="both"/>
-        <w:rPr>
-          <w:rFonts w:ascii="Times New Roman" w:hAnsi="Times New Roman" w:cs="Times New Roman"/>
-          <w:b/>
-          <w:bCs/>
-          <w:sz w:val="28"/>
-          <w:szCs w:val="28"/>
-        </w:rPr>
-      </w:pPr>
-    </w:p>
-    <w:p>
-      <w:pPr>
-        <w:pStyle w:val="ListParagraph"/>
-        <w:numPr>
-          <w:ilvl w:val="1"/>
-          <w:numId w:val="18"/>
-        </w:numPr>
-        <w:jc w:val="both"/>
-        <w:rPr>
-          <w:rFonts w:ascii="Times New Roman" w:hAnsi="Times New Roman" w:cs="Times New Roman"/>
-          <w:b/>
-          <w:bCs/>
-          <w:sz w:val="28"/>
-          <w:szCs w:val="28"/>
-        </w:rPr>
-      </w:pPr>
-      <w:r>
-        <w:rPr>
-          <w:rFonts w:ascii="Times New Roman" w:hAnsi="Times New Roman" w:cs="Times New Roman"/>
-          <w:sz w:val="28"/>
-          <w:szCs w:val="28"/>
-        </w:rPr>
-        <w:t>Sorting in descending order:</w:t>
-      </w:r>
-    </w:p>
-    <w:p>
-      <w:pPr>
-        <w:pStyle w:val="ListParagraph"/>
-        <w:ind w:left="1440"/>
-        <w:jc w:val="both"/>
-        <w:rPr>
-          <w:rFonts w:ascii="Times New Roman" w:hAnsi="Times New Roman" w:cs="Times New Roman"/>
-          <w:b/>
-          <w:bCs/>
-          <w:sz w:val="28"/>
-          <w:szCs w:val="28"/>
-        </w:rPr>
-      </w:pPr>
-      <w:r>
-        <w:rPr>
-          <w:rFonts w:ascii="Times New Roman" w:hAnsi="Times New Roman" w:cs="Times New Roman"/>
-          <w:b/>
-          <w:bCs/>
-          <w:noProof/>
-          <w:sz w:val="28"/>
-          <w:szCs w:val="28"/>
-        </w:rPr>
-        <w:drawing>
-          <wp:inline distT="0" distB="0" distL="0" distR="0" wp14:anchorId="3766AFDE" wp14:editId="46E06A48">
-            <wp:extent cx="3518535" cy="1462207"/>
-            <wp:effectExtent l="0" t="0" r="5715" b="5080"/>
-            <wp:docPr id="717778660" name="Picture 3"/>
-            <wp:cNvGraphicFramePr>
-              <a:graphicFrameLocks xmlns:a="http://schemas.openxmlformats.org/drawingml/2006/main" noChangeAspect="1"/>
-            </wp:cNvGraphicFramePr>
-            <a:graphic xmlns:a="http://schemas.openxmlformats.org/drawingml/2006/main">
-              <a:graphicData uri="http://schemas.openxmlformats.org/drawingml/2006/picture">
-                <pic:pic xmlns:pic="http://schemas.openxmlformats.org/drawingml/2006/picture">
-                  <pic:nvPicPr>
-                    <pic:cNvPr id="717778660" name="Picture 717778660"/>
-                    <pic:cNvPicPr/>
-                  </pic:nvPicPr>
-                  <pic:blipFill rotWithShape="1">
-                    <a:blip r:embed="rId9">
-                      <a:extLst>
-                        <a:ext uri="{28A0092B-C50C-407E-A947-70E740481C1C}">
-                          <a14:useLocalDpi xmlns:a14="http://schemas.microsoft.com/office/drawing/2010/main" val="0"/>
-                        </a:ext>
-                      </a:extLst>
-                    </a:blip>
-                    <a:srcRect l="928" t="1890" r="1014"/>
+                    <a:srcRect t="-1" b="41232"/>
                     <a:stretch>
                       <a:fillRect/>
                     </a:stretch>
@@ -2044,11 +1487,12 @@
                   <pic:spPr bwMode="auto">
                     <a:xfrm>
                       <a:off x="0" y="0"/>
-                      <a:ext cx="3555064" cy="1477388"/>
+                      <a:ext cx="5218086" cy="2176855"/>
                     </a:xfrm>
                     <a:prstGeom prst="rect">
                       <a:avLst/>
                     </a:prstGeom>
+                    <a:noFill/>
                     <a:ln>
                       <a:noFill/>
                     </a:ln>
@@ -2072,8 +1516,6 @@
         <w:jc w:val="both"/>
         <w:rPr>
           <w:rFonts w:ascii="Times New Roman" w:hAnsi="Times New Roman" w:cs="Times New Roman"/>
-          <w:b/>
-          <w:bCs/>
           <w:sz w:val="28"/>
           <w:szCs w:val="28"/>
         </w:rPr>
@@ -2089,48 +1531,141 @@
         <w:jc w:val="both"/>
         <w:rPr>
           <w:rFonts w:ascii="Times New Roman" w:hAnsi="Times New Roman" w:cs="Times New Roman"/>
-          <w:b/>
-          <w:bCs/>
-          <w:sz w:val="28"/>
-          <w:szCs w:val="28"/>
-        </w:rPr>
-      </w:pPr>
-      <w:r>
-        <w:rPr>
-          <w:rFonts w:ascii="Times New Roman" w:hAnsi="Times New Roman" w:cs="Times New Roman"/>
-          <w:sz w:val="28"/>
-          <w:szCs w:val="28"/>
-        </w:rPr>
-        <w:t>Priority based sorting:</w:t>
+          <w:sz w:val="28"/>
+          <w:szCs w:val="28"/>
+        </w:rPr>
+      </w:pPr>
+      <w:r>
+        <w:rPr>
+          <w:rFonts w:ascii="Times New Roman" w:hAnsi="Times New Roman" w:cs="Times New Roman"/>
+          <w:sz w:val="28"/>
+          <w:szCs w:val="28"/>
+        </w:rPr>
+        <w:t>Filtering Data using conditions</w:t>
       </w:r>
     </w:p>
     <w:p>
       <w:pPr>
         <w:pStyle w:val="ListParagraph"/>
-        <w:ind w:left="1440"/>
-        <w:jc w:val="both"/>
-        <w:rPr>
-          <w:rFonts w:ascii="Times New Roman" w:hAnsi="Times New Roman" w:cs="Times New Roman"/>
-          <w:b/>
-          <w:bCs/>
-          <w:sz w:val="28"/>
-          <w:szCs w:val="28"/>
-        </w:rPr>
-      </w:pPr>
-      <w:r>
-        <w:rPr>
-          <w:rFonts w:ascii="Times New Roman" w:hAnsi="Times New Roman" w:cs="Times New Roman"/>
-          <w:b/>
-          <w:bCs/>
+        <w:numPr>
+          <w:ilvl w:val="2"/>
+          <w:numId w:val="18"/>
+        </w:numPr>
+        <w:jc w:val="both"/>
+        <w:rPr>
+          <w:rFonts w:ascii="Times New Roman" w:hAnsi="Times New Roman" w:cs="Times New Roman"/>
+          <w:sz w:val="24"/>
+          <w:szCs w:val="24"/>
+        </w:rPr>
+      </w:pPr>
+      <w:r>
+        <w:rPr>
+          <w:rFonts w:ascii="Times New Roman" w:hAnsi="Times New Roman" w:cs="Times New Roman"/>
+          <w:sz w:val="24"/>
+          <w:szCs w:val="24"/>
+        </w:rPr>
+        <w:t>Select</w:t>
+      </w:r>
+      <w:r>
+        <w:rPr>
+          <w:rFonts w:ascii="Times New Roman" w:hAnsi="Times New Roman" w:cs="Times New Roman"/>
+          <w:sz w:val="24"/>
+          <w:szCs w:val="24"/>
+        </w:rPr>
+        <w:t xml:space="preserve"> * </w:t>
+      </w:r>
+      <w:r>
+        <w:rPr>
+          <w:rFonts w:ascii="Times New Roman" w:hAnsi="Times New Roman" w:cs="Times New Roman"/>
+          <w:sz w:val="24"/>
+          <w:szCs w:val="24"/>
+        </w:rPr>
+        <w:t>from</w:t>
+      </w:r>
+      <w:r>
+        <w:rPr>
+          <w:rFonts w:ascii="Times New Roman" w:hAnsi="Times New Roman" w:cs="Times New Roman"/>
+          <w:sz w:val="24"/>
+          <w:szCs w:val="24"/>
+        </w:rPr>
+        <w:t xml:space="preserve"> </w:t>
+      </w:r>
+      <w:proofErr w:type="spellStart"/>
+      <w:r>
+        <w:rPr>
+          <w:rFonts w:ascii="Times New Roman" w:hAnsi="Times New Roman" w:cs="Times New Roman"/>
+          <w:sz w:val="24"/>
+          <w:szCs w:val="24"/>
+        </w:rPr>
+        <w:t>customer_orders</w:t>
+      </w:r>
+      <w:proofErr w:type="spellEnd"/>
+      <w:r>
+        <w:rPr>
+          <w:rFonts w:ascii="Times New Roman" w:hAnsi="Times New Roman" w:cs="Times New Roman"/>
+          <w:sz w:val="24"/>
+          <w:szCs w:val="24"/>
+        </w:rPr>
+        <w:t xml:space="preserve"> </w:t>
+      </w:r>
+      <w:r>
+        <w:rPr>
+          <w:rFonts w:ascii="Times New Roman" w:hAnsi="Times New Roman" w:cs="Times New Roman"/>
+          <w:sz w:val="24"/>
+          <w:szCs w:val="24"/>
+        </w:rPr>
+        <w:t>where</w:t>
+      </w:r>
+      <w:r>
+        <w:rPr>
+          <w:rFonts w:ascii="Times New Roman" w:hAnsi="Times New Roman" w:cs="Times New Roman"/>
+          <w:sz w:val="24"/>
+          <w:szCs w:val="24"/>
+        </w:rPr>
+        <w:t xml:space="preserve"> </w:t>
+      </w:r>
+      <w:r>
+        <w:rPr>
+          <w:rFonts w:ascii="Times New Roman" w:hAnsi="Times New Roman" w:cs="Times New Roman"/>
+          <w:sz w:val="24"/>
+          <w:szCs w:val="24"/>
+        </w:rPr>
+        <w:t xml:space="preserve">price &gt; </w:t>
+      </w:r>
+      <w:proofErr w:type="gramStart"/>
+      <w:r>
+        <w:rPr>
+          <w:rFonts w:ascii="Times New Roman" w:hAnsi="Times New Roman" w:cs="Times New Roman"/>
+          <w:sz w:val="24"/>
+          <w:szCs w:val="24"/>
+        </w:rPr>
+        <w:t>45000;</w:t>
+      </w:r>
+      <w:proofErr w:type="gramEnd"/>
+    </w:p>
+    <w:p>
+      <w:pPr>
+        <w:pStyle w:val="ListParagraph"/>
+        <w:ind w:left="2160"/>
+        <w:jc w:val="both"/>
+        <w:rPr>
+          <w:rFonts w:ascii="Times New Roman" w:hAnsi="Times New Roman" w:cs="Times New Roman"/>
+          <w:sz w:val="24"/>
+          <w:szCs w:val="24"/>
+        </w:rPr>
+      </w:pPr>
+      <w:r>
+        <w:rPr>
+          <w:rFonts w:ascii="Times New Roman" w:hAnsi="Times New Roman" w:cs="Times New Roman"/>
           <w:noProof/>
-          <w:sz w:val="28"/>
-          <w:szCs w:val="28"/>
+          <w:sz w:val="24"/>
+          <w:szCs w:val="24"/>
         </w:rPr>
         <w:drawing>
-          <wp:inline distT="0" distB="0" distL="0" distR="0" wp14:anchorId="5DF5F746" wp14:editId="614356BE">
-            <wp:extent cx="3518535" cy="1890239"/>
-            <wp:effectExtent l="0" t="0" r="5715" b="0"/>
-            <wp:docPr id="1363626004" name="Picture 4"/>
+          <wp:inline distT="0" distB="0" distL="0" distR="0" wp14:anchorId="71416AC4" wp14:editId="436BDAE3">
+            <wp:extent cx="5166360" cy="865010"/>
+            <wp:effectExtent l="0" t="0" r="0" b="0"/>
+            <wp:docPr id="303089700" name="Picture 2"/>
             <wp:cNvGraphicFramePr>
               <a:graphicFrameLocks xmlns:a="http://schemas.openxmlformats.org/drawingml/2006/main" noChangeAspect="1"/>
             </wp:cNvGraphicFramePr>
@@ -2138,10 +1673,334 @@
               <a:graphicData uri="http://schemas.openxmlformats.org/drawingml/2006/picture">
                 <pic:pic xmlns:pic="http://schemas.openxmlformats.org/drawingml/2006/picture">
                   <pic:nvPicPr>
-                    <pic:cNvPr id="1363626004" name="Picture 1363626004"/>
-                    <pic:cNvPicPr/>
+                    <pic:cNvPr id="0" name="Picture 2"/>
+                    <pic:cNvPicPr>
+                      <a:picLocks noChangeAspect="1" noChangeArrowheads="1"/>
+                    </pic:cNvPicPr>
                   </pic:nvPicPr>
                   <pic:blipFill>
+                    <a:blip r:embed="rId9">
+                      <a:extLst>
+                        <a:ext uri="{28A0092B-C50C-407E-A947-70E740481C1C}">
+                          <a14:useLocalDpi xmlns:a14="http://schemas.microsoft.com/office/drawing/2010/main" val="0"/>
+                        </a:ext>
+                      </a:extLst>
+                    </a:blip>
+                    <a:srcRect/>
+                    <a:stretch>
+                      <a:fillRect/>
+                    </a:stretch>
+                  </pic:blipFill>
+                  <pic:spPr bwMode="auto">
+                    <a:xfrm>
+                      <a:off x="0" y="0"/>
+                      <a:ext cx="5206251" cy="871689"/>
+                    </a:xfrm>
+                    <a:prstGeom prst="rect">
+                      <a:avLst/>
+                    </a:prstGeom>
+                    <a:noFill/>
+                    <a:ln>
+                      <a:noFill/>
+                    </a:ln>
+                  </pic:spPr>
+                </pic:pic>
+              </a:graphicData>
+            </a:graphic>
+          </wp:inline>
+        </w:drawing>
+      </w:r>
+    </w:p>
+    <w:p>
+      <w:pPr>
+        <w:pStyle w:val="ListParagraph"/>
+        <w:ind w:left="1440"/>
+        <w:jc w:val="both"/>
+        <w:rPr>
+          <w:rFonts w:ascii="Times New Roman" w:hAnsi="Times New Roman" w:cs="Times New Roman"/>
+          <w:sz w:val="24"/>
+          <w:szCs w:val="24"/>
+        </w:rPr>
+      </w:pPr>
+    </w:p>
+    <w:p>
+      <w:pPr>
+        <w:pStyle w:val="ListParagraph"/>
+        <w:numPr>
+          <w:ilvl w:val="1"/>
+          <w:numId w:val="18"/>
+        </w:numPr>
+        <w:jc w:val="both"/>
+        <w:rPr>
+          <w:rFonts w:ascii="Times New Roman" w:hAnsi="Times New Roman" w:cs="Times New Roman"/>
+          <w:sz w:val="28"/>
+          <w:szCs w:val="28"/>
+        </w:rPr>
+      </w:pPr>
+      <w:r>
+        <w:rPr>
+          <w:rFonts w:ascii="Times New Roman" w:hAnsi="Times New Roman" w:cs="Times New Roman"/>
+          <w:sz w:val="28"/>
+          <w:szCs w:val="28"/>
+        </w:rPr>
+        <w:t>Sorting Query Results:</w:t>
+      </w:r>
+    </w:p>
+    <w:p>
+      <w:pPr>
+        <w:pStyle w:val="ListParagraph"/>
+        <w:numPr>
+          <w:ilvl w:val="2"/>
+          <w:numId w:val="18"/>
+        </w:numPr>
+        <w:jc w:val="both"/>
+        <w:rPr>
+          <w:rFonts w:ascii="Times New Roman" w:hAnsi="Times New Roman" w:cs="Times New Roman"/>
+          <w:sz w:val="28"/>
+          <w:szCs w:val="28"/>
+        </w:rPr>
+      </w:pPr>
+      <w:r>
+        <w:rPr>
+          <w:rFonts w:ascii="Times New Roman" w:hAnsi="Times New Roman" w:cs="Times New Roman"/>
+          <w:sz w:val="28"/>
+          <w:szCs w:val="28"/>
+        </w:rPr>
+        <w:t xml:space="preserve">Sorting in descending order: </w:t>
+      </w:r>
+      <w:r>
+        <w:rPr>
+          <w:rFonts w:ascii="Times New Roman" w:hAnsi="Times New Roman" w:cs="Times New Roman"/>
+          <w:sz w:val="28"/>
+          <w:szCs w:val="28"/>
+        </w:rPr>
+        <w:br/>
+      </w:r>
+      <w:r>
+        <w:rPr>
+          <w:rFonts w:ascii="Times New Roman" w:hAnsi="Times New Roman" w:cs="Times New Roman"/>
+          <w:sz w:val="24"/>
+          <w:szCs w:val="24"/>
+        </w:rPr>
+        <w:t>S</w:t>
+      </w:r>
+      <w:r>
+        <w:rPr>
+          <w:rFonts w:ascii="Times New Roman" w:hAnsi="Times New Roman" w:cs="Times New Roman"/>
+          <w:sz w:val="24"/>
+          <w:szCs w:val="24"/>
+        </w:rPr>
+        <w:t>elect</w:t>
+      </w:r>
+      <w:r>
+        <w:rPr>
+          <w:rFonts w:ascii="Times New Roman" w:hAnsi="Times New Roman" w:cs="Times New Roman"/>
+          <w:sz w:val="24"/>
+          <w:szCs w:val="24"/>
+        </w:rPr>
+        <w:t xml:space="preserve"> </w:t>
+      </w:r>
+      <w:proofErr w:type="spellStart"/>
+      <w:r>
+        <w:rPr>
+          <w:rFonts w:ascii="Times New Roman" w:hAnsi="Times New Roman" w:cs="Times New Roman"/>
+          <w:sz w:val="24"/>
+          <w:szCs w:val="24"/>
+        </w:rPr>
+        <w:t>order_id</w:t>
+      </w:r>
+      <w:proofErr w:type="spellEnd"/>
+      <w:r>
+        <w:rPr>
+          <w:rFonts w:ascii="Times New Roman" w:hAnsi="Times New Roman" w:cs="Times New Roman"/>
+          <w:sz w:val="24"/>
+          <w:szCs w:val="24"/>
+        </w:rPr>
+        <w:t>,</w:t>
+      </w:r>
+      <w:r>
+        <w:rPr>
+          <w:rFonts w:ascii="Times New Roman" w:hAnsi="Times New Roman" w:cs="Times New Roman"/>
+          <w:sz w:val="24"/>
+          <w:szCs w:val="24"/>
+        </w:rPr>
+        <w:t xml:space="preserve"> </w:t>
+      </w:r>
+      <w:proofErr w:type="spellStart"/>
+      <w:r>
+        <w:rPr>
+          <w:rFonts w:ascii="Times New Roman" w:hAnsi="Times New Roman" w:cs="Times New Roman"/>
+          <w:sz w:val="24"/>
+          <w:szCs w:val="24"/>
+        </w:rPr>
+        <w:t>customer_name</w:t>
+      </w:r>
+      <w:proofErr w:type="spellEnd"/>
+      <w:r>
+        <w:rPr>
+          <w:rFonts w:ascii="Times New Roman" w:hAnsi="Times New Roman" w:cs="Times New Roman"/>
+          <w:sz w:val="24"/>
+          <w:szCs w:val="24"/>
+        </w:rPr>
+        <w:t xml:space="preserve"> as name,</w:t>
+      </w:r>
+      <w:r>
+        <w:rPr>
+          <w:rFonts w:ascii="Times New Roman" w:hAnsi="Times New Roman" w:cs="Times New Roman"/>
+          <w:sz w:val="24"/>
+          <w:szCs w:val="24"/>
+        </w:rPr>
+        <w:t xml:space="preserve"> </w:t>
+      </w:r>
+      <w:r>
+        <w:rPr>
+          <w:rFonts w:ascii="Times New Roman" w:hAnsi="Times New Roman" w:cs="Times New Roman"/>
+          <w:sz w:val="24"/>
+          <w:szCs w:val="24"/>
+        </w:rPr>
+        <w:t xml:space="preserve">price as </w:t>
+      </w:r>
+      <w:proofErr w:type="spellStart"/>
+      <w:r>
+        <w:rPr>
+          <w:rFonts w:ascii="Times New Roman" w:hAnsi="Times New Roman" w:cs="Times New Roman"/>
+          <w:sz w:val="24"/>
+          <w:szCs w:val="24"/>
+        </w:rPr>
+        <w:t>shopping_value</w:t>
+      </w:r>
+      <w:proofErr w:type="spellEnd"/>
+      <w:r>
+        <w:rPr>
+          <w:rFonts w:ascii="Times New Roman" w:hAnsi="Times New Roman" w:cs="Times New Roman"/>
+          <w:sz w:val="24"/>
+          <w:szCs w:val="24"/>
+        </w:rPr>
+        <w:t xml:space="preserve"> </w:t>
+      </w:r>
+      <w:r>
+        <w:rPr>
+          <w:rFonts w:ascii="Times New Roman" w:hAnsi="Times New Roman" w:cs="Times New Roman"/>
+          <w:sz w:val="24"/>
+          <w:szCs w:val="24"/>
+        </w:rPr>
+        <w:t>from</w:t>
+      </w:r>
+      <w:r>
+        <w:rPr>
+          <w:rFonts w:ascii="Times New Roman" w:hAnsi="Times New Roman" w:cs="Times New Roman"/>
+          <w:sz w:val="24"/>
+          <w:szCs w:val="24"/>
+        </w:rPr>
+        <w:t xml:space="preserve"> </w:t>
+      </w:r>
+      <w:proofErr w:type="spellStart"/>
+      <w:r>
+        <w:rPr>
+          <w:rFonts w:ascii="Times New Roman" w:hAnsi="Times New Roman" w:cs="Times New Roman"/>
+          <w:sz w:val="24"/>
+          <w:szCs w:val="24"/>
+        </w:rPr>
+        <w:t>customer_orders</w:t>
+      </w:r>
+      <w:proofErr w:type="spellEnd"/>
+      <w:r>
+        <w:rPr>
+          <w:rFonts w:ascii="Times New Roman" w:hAnsi="Times New Roman" w:cs="Times New Roman"/>
+          <w:sz w:val="24"/>
+          <w:szCs w:val="24"/>
+        </w:rPr>
+        <w:t xml:space="preserve"> </w:t>
+      </w:r>
+      <w:r>
+        <w:rPr>
+          <w:rFonts w:ascii="Times New Roman" w:hAnsi="Times New Roman" w:cs="Times New Roman"/>
+          <w:sz w:val="24"/>
+          <w:szCs w:val="24"/>
+        </w:rPr>
+        <w:t>order by</w:t>
+      </w:r>
+      <w:r>
+        <w:rPr>
+          <w:rFonts w:ascii="Times New Roman" w:hAnsi="Times New Roman" w:cs="Times New Roman"/>
+          <w:sz w:val="24"/>
+          <w:szCs w:val="24"/>
+        </w:rPr>
+        <w:t xml:space="preserve"> </w:t>
+      </w:r>
+      <w:proofErr w:type="spellStart"/>
+      <w:r>
+        <w:rPr>
+          <w:rFonts w:ascii="Times New Roman" w:hAnsi="Times New Roman" w:cs="Times New Roman"/>
+          <w:sz w:val="24"/>
+          <w:szCs w:val="24"/>
+        </w:rPr>
+        <w:t>shopping_value</w:t>
+      </w:r>
+      <w:proofErr w:type="spellEnd"/>
+      <w:r>
+        <w:rPr>
+          <w:rFonts w:ascii="Times New Roman" w:hAnsi="Times New Roman" w:cs="Times New Roman"/>
+          <w:sz w:val="24"/>
+          <w:szCs w:val="24"/>
+        </w:rPr>
+        <w:t xml:space="preserve"> </w:t>
+      </w:r>
+      <w:proofErr w:type="gramStart"/>
+      <w:r>
+        <w:rPr>
+          <w:rFonts w:ascii="Times New Roman" w:hAnsi="Times New Roman" w:cs="Times New Roman"/>
+          <w:sz w:val="24"/>
+          <w:szCs w:val="24"/>
+        </w:rPr>
+        <w:t>desc</w:t>
+      </w:r>
+      <w:r>
+        <w:rPr>
+          <w:rFonts w:ascii="Times New Roman" w:hAnsi="Times New Roman" w:cs="Times New Roman"/>
+          <w:sz w:val="24"/>
+          <w:szCs w:val="24"/>
+        </w:rPr>
+        <w:t>;</w:t>
+      </w:r>
+      <w:proofErr w:type="gramEnd"/>
+    </w:p>
+    <w:p>
+      <w:pPr>
+        <w:pStyle w:val="ListParagraph"/>
+        <w:ind w:left="2160"/>
+        <w:jc w:val="both"/>
+        <w:rPr>
+          <w:rFonts w:ascii="Times New Roman" w:hAnsi="Times New Roman" w:cs="Times New Roman"/>
+          <w:sz w:val="28"/>
+          <w:szCs w:val="28"/>
+        </w:rPr>
+      </w:pPr>
+      <w:r>
+        <w:rPr>
+          <w:rFonts w:ascii="Times New Roman" w:hAnsi="Times New Roman" w:cs="Times New Roman"/>
+          <w:noProof/>
+          <w:sz w:val="24"/>
+          <w:szCs w:val="24"/>
+        </w:rPr>
+        <w:drawing>
+          <wp:inline distT="0" distB="0" distL="0" distR="0" wp14:anchorId="1F2B55DE" wp14:editId="1C7378F0">
+            <wp:extent cx="3197225" cy="1889760"/>
+            <wp:effectExtent l="0" t="0" r="3175" b="0"/>
+            <wp:docPr id="732169356" name="Picture 3"/>
+            <wp:cNvGraphicFramePr>
+              <a:graphicFrameLocks xmlns:a="http://schemas.openxmlformats.org/drawingml/2006/main" noChangeAspect="1"/>
+            </wp:cNvGraphicFramePr>
+            <a:graphic xmlns:a="http://schemas.openxmlformats.org/drawingml/2006/main">
+              <a:graphicData uri="http://schemas.openxmlformats.org/drawingml/2006/picture">
+                <pic:pic xmlns:pic="http://schemas.openxmlformats.org/drawingml/2006/picture">
+                  <pic:nvPicPr>
+                    <pic:cNvPr id="0" name="Picture 3"/>
+                    <pic:cNvPicPr>
+                      <a:picLocks noChangeAspect="1" noChangeArrowheads="1"/>
+                    </pic:cNvPicPr>
+                  </pic:nvPicPr>
+                  <pic:blipFill rotWithShape="1">
                     <a:blip r:embed="rId10">
                       <a:extLst>
                         <a:ext uri="{28A0092B-C50C-407E-A947-70E740481C1C}">
@@ -2149,18 +2008,28 @@
                         </a:ext>
                       </a:extLst>
                     </a:blip>
+                    <a:srcRect b="51274"/>
                     <a:stretch>
                       <a:fillRect/>
                     </a:stretch>
                   </pic:blipFill>
-                  <pic:spPr>
+                  <pic:spPr bwMode="auto">
                     <a:xfrm>
                       <a:off x="0" y="0"/>
-                      <a:ext cx="3539984" cy="1901762"/>
+                      <a:ext cx="3209926" cy="1897267"/>
                     </a:xfrm>
                     <a:prstGeom prst="rect">
                       <a:avLst/>
                     </a:prstGeom>
+                    <a:noFill/>
+                    <a:ln>
+                      <a:noFill/>
+                    </a:ln>
+                    <a:extLst>
+                      <a:ext uri="{53640926-AAD7-44D8-BBD7-CCE9431645EC}">
+                        <a14:shadowObscured xmlns:a14="http://schemas.microsoft.com/office/drawing/2010/main"/>
+                      </a:ext>
+                    </a:extLst>
                   </pic:spPr>
                 </pic:pic>
               </a:graphicData>
@@ -2172,66 +2041,10 @@
     <w:p>
       <w:pPr>
         <w:pStyle w:val="ListParagraph"/>
-        <w:ind w:left="1440"/>
-        <w:jc w:val="both"/>
-        <w:rPr>
-          <w:rFonts w:ascii="Times New Roman" w:hAnsi="Times New Roman" w:cs="Times New Roman"/>
-          <w:b/>
-          <w:bCs/>
-          <w:sz w:val="28"/>
-          <w:szCs w:val="28"/>
-        </w:rPr>
-      </w:pPr>
-    </w:p>
-    <w:p>
-      <w:pPr>
-        <w:pStyle w:val="ListParagraph"/>
-        <w:ind w:left="1440"/>
-        <w:jc w:val="both"/>
-        <w:rPr>
-          <w:rFonts w:ascii="Times New Roman" w:hAnsi="Times New Roman" w:cs="Times New Roman"/>
-          <w:b/>
-          <w:bCs/>
-          <w:sz w:val="28"/>
-          <w:szCs w:val="28"/>
-        </w:rPr>
-      </w:pPr>
-    </w:p>
-    <w:p>
-      <w:pPr>
-        <w:pStyle w:val="ListParagraph"/>
-        <w:ind w:left="1440"/>
-        <w:jc w:val="both"/>
-        <w:rPr>
-          <w:rFonts w:ascii="Times New Roman" w:hAnsi="Times New Roman" w:cs="Times New Roman"/>
-          <w:b/>
-          <w:bCs/>
-          <w:sz w:val="28"/>
-          <w:szCs w:val="28"/>
-        </w:rPr>
-      </w:pPr>
-    </w:p>
-    <w:p>
-      <w:pPr>
-        <w:pStyle w:val="ListParagraph"/>
-        <w:ind w:left="1440"/>
-        <w:jc w:val="both"/>
-        <w:rPr>
-          <w:rFonts w:ascii="Times New Roman" w:hAnsi="Times New Roman" w:cs="Times New Roman"/>
-          <w:b/>
-          <w:bCs/>
-          <w:sz w:val="28"/>
-          <w:szCs w:val="28"/>
-        </w:rPr>
-      </w:pPr>
-    </w:p>
-    <w:p>
-      <w:pPr>
-        <w:jc w:val="both"/>
-        <w:rPr>
-          <w:rFonts w:ascii="Times New Roman" w:hAnsi="Times New Roman" w:cs="Times New Roman"/>
-          <w:b/>
-          <w:bCs/>
+        <w:ind w:left="2160"/>
+        <w:jc w:val="both"/>
+        <w:rPr>
+          <w:rFonts w:ascii="Times New Roman" w:hAnsi="Times New Roman" w:cs="Times New Roman"/>
           <w:sz w:val="28"/>
           <w:szCs w:val="28"/>
         </w:rPr>
@@ -2241,65 +2054,263 @@
       <w:pPr>
         <w:pStyle w:val="ListParagraph"/>
         <w:numPr>
-          <w:ilvl w:val="1"/>
+          <w:ilvl w:val="2"/>
           <w:numId w:val="18"/>
         </w:numPr>
         <w:jc w:val="both"/>
         <w:rPr>
           <w:rFonts w:ascii="Times New Roman" w:hAnsi="Times New Roman" w:cs="Times New Roman"/>
-          <w:b/>
-          <w:bCs/>
-          <w:sz w:val="28"/>
-          <w:szCs w:val="28"/>
-        </w:rPr>
-      </w:pPr>
-      <w:r>
-        <w:rPr>
-          <w:rFonts w:ascii="Times New Roman" w:hAnsi="Times New Roman" w:cs="Times New Roman"/>
-          <w:sz w:val="28"/>
-          <w:szCs w:val="28"/>
-        </w:rPr>
-        <w:t>Grouping data for aggregation:</w:t>
-      </w:r>
-      <w:r>
-        <w:rPr>
-          <w:rFonts w:ascii="Times New Roman" w:hAnsi="Times New Roman" w:cs="Times New Roman"/>
-          <w:b/>
-          <w:bCs/>
+          <w:sz w:val="24"/>
+          <w:szCs w:val="24"/>
+        </w:rPr>
+      </w:pPr>
+      <w:r>
+        <w:rPr>
+          <w:rFonts w:ascii="Times New Roman" w:hAnsi="Times New Roman" w:cs="Times New Roman"/>
+          <w:sz w:val="28"/>
+          <w:szCs w:val="28"/>
+        </w:rPr>
+        <w:lastRenderedPageBreak/>
+        <w:t xml:space="preserve">Priority based sorting: </w:t>
+      </w:r>
+      <w:r>
+        <w:rPr>
+          <w:rFonts w:ascii="Times New Roman" w:hAnsi="Times New Roman" w:cs="Times New Roman"/>
+          <w:sz w:val="28"/>
+          <w:szCs w:val="28"/>
+        </w:rPr>
+        <w:br/>
+      </w:r>
+      <w:r>
+        <w:rPr>
+          <w:rFonts w:ascii="Times New Roman" w:hAnsi="Times New Roman" w:cs="Times New Roman"/>
+          <w:sz w:val="24"/>
+          <w:szCs w:val="24"/>
+        </w:rPr>
+        <w:t>S</w:t>
+      </w:r>
+      <w:r>
+        <w:rPr>
+          <w:rFonts w:ascii="Times New Roman" w:hAnsi="Times New Roman" w:cs="Times New Roman"/>
+          <w:sz w:val="24"/>
+          <w:szCs w:val="24"/>
+        </w:rPr>
+        <w:t>elect</w:t>
+      </w:r>
+      <w:r>
+        <w:rPr>
+          <w:rFonts w:ascii="Times New Roman" w:hAnsi="Times New Roman" w:cs="Times New Roman"/>
+          <w:sz w:val="24"/>
+          <w:szCs w:val="24"/>
+        </w:rPr>
+        <w:t xml:space="preserve"> </w:t>
+      </w:r>
+      <w:proofErr w:type="spellStart"/>
+      <w:r>
+        <w:rPr>
+          <w:rFonts w:ascii="Times New Roman" w:hAnsi="Times New Roman" w:cs="Times New Roman"/>
+          <w:sz w:val="24"/>
+          <w:szCs w:val="24"/>
+        </w:rPr>
+        <w:t>order_id</w:t>
+      </w:r>
+      <w:proofErr w:type="spellEnd"/>
+      <w:r>
+        <w:rPr>
+          <w:rFonts w:ascii="Times New Roman" w:hAnsi="Times New Roman" w:cs="Times New Roman"/>
+          <w:sz w:val="24"/>
+          <w:szCs w:val="24"/>
+        </w:rPr>
+        <w:t>,</w:t>
+      </w:r>
+      <w:r>
+        <w:rPr>
+          <w:rFonts w:ascii="Times New Roman" w:hAnsi="Times New Roman" w:cs="Times New Roman"/>
+          <w:sz w:val="24"/>
+          <w:szCs w:val="24"/>
+        </w:rPr>
+        <w:t xml:space="preserve"> </w:t>
+      </w:r>
+      <w:proofErr w:type="spellStart"/>
+      <w:r>
+        <w:rPr>
+          <w:rFonts w:ascii="Times New Roman" w:hAnsi="Times New Roman" w:cs="Times New Roman"/>
+          <w:sz w:val="24"/>
+          <w:szCs w:val="24"/>
+        </w:rPr>
+        <w:t>customer_name</w:t>
+      </w:r>
+      <w:proofErr w:type="spellEnd"/>
+      <w:r>
+        <w:rPr>
+          <w:rFonts w:ascii="Times New Roman" w:hAnsi="Times New Roman" w:cs="Times New Roman"/>
+          <w:sz w:val="24"/>
+          <w:szCs w:val="24"/>
+        </w:rPr>
+        <w:t xml:space="preserve"> as name,</w:t>
+      </w:r>
+      <w:r>
+        <w:rPr>
+          <w:rFonts w:ascii="Times New Roman" w:hAnsi="Times New Roman" w:cs="Times New Roman"/>
+          <w:sz w:val="24"/>
+          <w:szCs w:val="24"/>
+        </w:rPr>
+        <w:t xml:space="preserve"> </w:t>
+      </w:r>
+      <w:r>
+        <w:rPr>
+          <w:rFonts w:ascii="Times New Roman" w:hAnsi="Times New Roman" w:cs="Times New Roman"/>
+          <w:sz w:val="24"/>
+          <w:szCs w:val="24"/>
+        </w:rPr>
+        <w:t xml:space="preserve">price as </w:t>
+      </w:r>
+      <w:proofErr w:type="spellStart"/>
+      <w:r>
+        <w:rPr>
+          <w:rFonts w:ascii="Times New Roman" w:hAnsi="Times New Roman" w:cs="Times New Roman"/>
+          <w:sz w:val="24"/>
+          <w:szCs w:val="24"/>
+        </w:rPr>
+        <w:t>shopping_value</w:t>
+      </w:r>
+      <w:proofErr w:type="spellEnd"/>
+      <w:r>
+        <w:rPr>
+          <w:rFonts w:ascii="Times New Roman" w:hAnsi="Times New Roman" w:cs="Times New Roman"/>
+          <w:sz w:val="24"/>
+          <w:szCs w:val="24"/>
+        </w:rPr>
+        <w:t xml:space="preserve"> </w:t>
+      </w:r>
+      <w:r>
+        <w:rPr>
+          <w:rFonts w:ascii="Times New Roman" w:hAnsi="Times New Roman" w:cs="Times New Roman"/>
+          <w:sz w:val="24"/>
+          <w:szCs w:val="24"/>
+        </w:rPr>
+        <w:t>from</w:t>
+      </w:r>
+      <w:r>
+        <w:rPr>
+          <w:rFonts w:ascii="Times New Roman" w:hAnsi="Times New Roman" w:cs="Times New Roman"/>
+          <w:sz w:val="24"/>
+          <w:szCs w:val="24"/>
+        </w:rPr>
+        <w:t xml:space="preserve"> </w:t>
+      </w:r>
+      <w:proofErr w:type="spellStart"/>
+      <w:r>
+        <w:rPr>
+          <w:rFonts w:ascii="Times New Roman" w:hAnsi="Times New Roman" w:cs="Times New Roman"/>
+          <w:sz w:val="24"/>
+          <w:szCs w:val="24"/>
+        </w:rPr>
+        <w:t>customer_orders</w:t>
+      </w:r>
+      <w:proofErr w:type="spellEnd"/>
+      <w:r>
+        <w:rPr>
+          <w:rFonts w:ascii="Times New Roman" w:hAnsi="Times New Roman" w:cs="Times New Roman"/>
+          <w:sz w:val="24"/>
+          <w:szCs w:val="24"/>
+        </w:rPr>
+        <w:t xml:space="preserve"> </w:t>
+      </w:r>
+      <w:r>
+        <w:rPr>
+          <w:rFonts w:ascii="Times New Roman" w:hAnsi="Times New Roman" w:cs="Times New Roman"/>
+          <w:sz w:val="24"/>
+          <w:szCs w:val="24"/>
+        </w:rPr>
+        <w:t>order by</w:t>
+      </w:r>
+      <w:r>
+        <w:rPr>
+          <w:rFonts w:ascii="Times New Roman" w:hAnsi="Times New Roman" w:cs="Times New Roman"/>
+          <w:sz w:val="24"/>
+          <w:szCs w:val="24"/>
+        </w:rPr>
+        <w:t xml:space="preserve"> </w:t>
+      </w:r>
+      <w:proofErr w:type="spellStart"/>
+      <w:r>
+        <w:rPr>
+          <w:rFonts w:ascii="Times New Roman" w:hAnsi="Times New Roman" w:cs="Times New Roman"/>
+          <w:sz w:val="24"/>
+          <w:szCs w:val="24"/>
+        </w:rPr>
+        <w:t>shopping_value</w:t>
+      </w:r>
+      <w:proofErr w:type="spellEnd"/>
+      <w:r>
+        <w:rPr>
+          <w:rFonts w:ascii="Times New Roman" w:hAnsi="Times New Roman" w:cs="Times New Roman"/>
+          <w:sz w:val="24"/>
+          <w:szCs w:val="24"/>
+        </w:rPr>
+        <w:t xml:space="preserve"> desc,</w:t>
+      </w:r>
+      <w:r>
+        <w:rPr>
+          <w:rFonts w:ascii="Times New Roman" w:hAnsi="Times New Roman" w:cs="Times New Roman"/>
+          <w:sz w:val="24"/>
+          <w:szCs w:val="24"/>
+        </w:rPr>
+        <w:t xml:space="preserve"> </w:t>
+      </w:r>
+      <w:proofErr w:type="spellStart"/>
+      <w:r>
+        <w:rPr>
+          <w:rFonts w:ascii="Times New Roman" w:hAnsi="Times New Roman" w:cs="Times New Roman"/>
+          <w:sz w:val="24"/>
+          <w:szCs w:val="24"/>
+        </w:rPr>
+        <w:t>order_</w:t>
+      </w:r>
+      <w:proofErr w:type="gramStart"/>
+      <w:r>
+        <w:rPr>
+          <w:rFonts w:ascii="Times New Roman" w:hAnsi="Times New Roman" w:cs="Times New Roman"/>
+          <w:sz w:val="24"/>
+          <w:szCs w:val="24"/>
+        </w:rPr>
+        <w:t>id</w:t>
+      </w:r>
+      <w:proofErr w:type="spellEnd"/>
+      <w:r>
+        <w:rPr>
+          <w:rFonts w:ascii="Times New Roman" w:hAnsi="Times New Roman" w:cs="Times New Roman"/>
+          <w:sz w:val="24"/>
+          <w:szCs w:val="24"/>
+        </w:rPr>
+        <w:t>;</w:t>
+      </w:r>
+      <w:proofErr w:type="gramEnd"/>
+    </w:p>
+    <w:p>
+      <w:pPr>
+        <w:pStyle w:val="ListParagraph"/>
+        <w:ind w:left="2160"/>
+        <w:jc w:val="both"/>
+        <w:rPr>
+          <w:rFonts w:ascii="Times New Roman" w:hAnsi="Times New Roman" w:cs="Times New Roman"/>
+          <w:sz w:val="24"/>
+          <w:szCs w:val="24"/>
+        </w:rPr>
+      </w:pPr>
+      <w:r>
+        <w:rPr>
+          <w:rFonts w:ascii="Times New Roman" w:hAnsi="Times New Roman" w:cs="Times New Roman"/>
           <w:noProof/>
-          <w:sz w:val="28"/>
-          <w:szCs w:val="28"/>
-        </w:rPr>
-        <w:t xml:space="preserve"> </w:t>
-      </w:r>
-    </w:p>
-    <w:p>
-      <w:pPr>
-        <w:pStyle w:val="ListParagraph"/>
-        <w:ind w:left="1440"/>
-        <w:jc w:val="both"/>
-        <w:rPr>
-          <w:rFonts w:ascii="Times New Roman" w:hAnsi="Times New Roman" w:cs="Times New Roman"/>
-          <w:b/>
-          <w:bCs/>
-          <w:sz w:val="28"/>
-          <w:szCs w:val="28"/>
-        </w:rPr>
-      </w:pPr>
-      <w:r>
-        <w:rPr>
-          <w:rFonts w:ascii="Times New Roman" w:hAnsi="Times New Roman" w:cs="Times New Roman"/>
-          <w:b/>
-          <w:bCs/>
-          <w:noProof/>
-          <w:sz w:val="28"/>
-          <w:szCs w:val="28"/>
+          <w:sz w:val="24"/>
+          <w:szCs w:val="24"/>
         </w:rPr>
         <w:drawing>
-          <wp:inline distT="0" distB="0" distL="0" distR="0" wp14:anchorId="5D4D59AE" wp14:editId="2B1B1223">
-            <wp:extent cx="3238841" cy="1160585"/>
-            <wp:effectExtent l="0" t="0" r="0" b="1905"/>
-            <wp:docPr id="510898562" name="Picture 6"/>
+          <wp:inline distT="0" distB="0" distL="0" distR="0" wp14:anchorId="15D1AAB6" wp14:editId="7DD9FA08">
+            <wp:extent cx="3192780" cy="1920776"/>
+            <wp:effectExtent l="0" t="0" r="7620" b="3810"/>
+            <wp:docPr id="1162892610" name="Picture 4"/>
             <wp:cNvGraphicFramePr>
               <a:graphicFrameLocks xmlns:a="http://schemas.openxmlformats.org/drawingml/2006/main" noChangeAspect="1"/>
             </wp:cNvGraphicFramePr>
@@ -2307,10 +2318,12 @@
               <a:graphicData uri="http://schemas.openxmlformats.org/drawingml/2006/picture">
                 <pic:pic xmlns:pic="http://schemas.openxmlformats.org/drawingml/2006/picture">
                   <pic:nvPicPr>
-                    <pic:cNvPr id="510898562" name="Picture 510898562"/>
-                    <pic:cNvPicPr/>
+                    <pic:cNvPr id="0" name="Picture 4"/>
+                    <pic:cNvPicPr>
+                      <a:picLocks noChangeAspect="1" noChangeArrowheads="1"/>
+                    </pic:cNvPicPr>
                   </pic:nvPicPr>
-                  <pic:blipFill>
+                  <pic:blipFill rotWithShape="1">
                     <a:blip r:embed="rId11">
                       <a:extLst>
                         <a:ext uri="{28A0092B-C50C-407E-A947-70E740481C1C}">
@@ -2318,18 +2331,28 @@
                         </a:ext>
                       </a:extLst>
                     </a:blip>
+                    <a:srcRect b="50914"/>
                     <a:stretch>
                       <a:fillRect/>
                     </a:stretch>
                   </pic:blipFill>
-                  <pic:spPr>
+                  <pic:spPr bwMode="auto">
                     <a:xfrm>
                       <a:off x="0" y="0"/>
-                      <a:ext cx="3266058" cy="1170338"/>
+                      <a:ext cx="3205889" cy="1928662"/>
                     </a:xfrm>
                     <a:prstGeom prst="rect">
                       <a:avLst/>
                     </a:prstGeom>
+                    <a:noFill/>
+                    <a:ln>
+                      <a:noFill/>
+                    </a:ln>
+                    <a:extLst>
+                      <a:ext uri="{53640926-AAD7-44D8-BBD7-CCE9431645EC}">
+                        <a14:shadowObscured xmlns:a14="http://schemas.microsoft.com/office/drawing/2010/main"/>
+                      </a:ext>
+                    </a:extLst>
                   </pic:spPr>
                 </pic:pic>
               </a:graphicData>
@@ -2341,14 +2364,10 @@
     <w:p>
       <w:pPr>
         <w:pStyle w:val="ListParagraph"/>
-        <w:ind w:left="1440"/>
-        <w:jc w:val="both"/>
-        <w:rPr>
-          <w:rFonts w:ascii="Times New Roman" w:hAnsi="Times New Roman" w:cs="Times New Roman"/>
-          <w:b/>
-          <w:bCs/>
-          <w:sz w:val="28"/>
-          <w:szCs w:val="28"/>
+        <w:rPr>
+          <w:rFonts w:ascii="Times New Roman" w:hAnsi="Times New Roman" w:cs="Times New Roman"/>
+          <w:sz w:val="24"/>
+          <w:szCs w:val="24"/>
         </w:rPr>
       </w:pPr>
     </w:p>
@@ -2362,59 +2381,219 @@
         <w:jc w:val="both"/>
         <w:rPr>
           <w:rFonts w:ascii="Times New Roman" w:hAnsi="Times New Roman" w:cs="Times New Roman"/>
-          <w:b/>
-          <w:bCs/>
-          <w:sz w:val="28"/>
-          <w:szCs w:val="28"/>
-        </w:rPr>
-      </w:pPr>
-      <w:r>
-        <w:rPr>
-          <w:rFonts w:ascii="Times New Roman" w:hAnsi="Times New Roman" w:cs="Times New Roman"/>
-          <w:sz w:val="28"/>
-          <w:szCs w:val="28"/>
-        </w:rPr>
-        <w:t>Conditions on aggregated data:</w:t>
-      </w:r>
-      <w:r>
-        <w:rPr>
-          <w:rFonts w:ascii="Times New Roman" w:hAnsi="Times New Roman" w:cs="Times New Roman"/>
-          <w:b/>
-          <w:bCs/>
+          <w:sz w:val="24"/>
+          <w:szCs w:val="24"/>
+        </w:rPr>
+      </w:pPr>
+      <w:r>
+        <w:rPr>
+          <w:rFonts w:ascii="Times New Roman" w:hAnsi="Times New Roman" w:cs="Times New Roman"/>
+          <w:sz w:val="28"/>
+          <w:szCs w:val="28"/>
+        </w:rPr>
+        <w:t>Grouping data for aggregation:</w:t>
+      </w:r>
+    </w:p>
+    <w:p>
+      <w:pPr>
+        <w:pStyle w:val="ListParagraph"/>
+        <w:numPr>
+          <w:ilvl w:val="2"/>
+          <w:numId w:val="18"/>
+        </w:numPr>
+        <w:jc w:val="both"/>
+        <w:rPr>
+          <w:rFonts w:ascii="Times New Roman" w:hAnsi="Times New Roman" w:cs="Times New Roman"/>
+          <w:sz w:val="24"/>
+          <w:szCs w:val="24"/>
+        </w:rPr>
+      </w:pPr>
+      <w:r>
+        <w:rPr>
+          <w:rFonts w:ascii="Times New Roman" w:hAnsi="Times New Roman" w:cs="Times New Roman"/>
+          <w:sz w:val="24"/>
+          <w:szCs w:val="24"/>
+        </w:rPr>
+        <w:t>Select</w:t>
+      </w:r>
+      <w:r>
+        <w:rPr>
+          <w:rFonts w:ascii="Times New Roman" w:hAnsi="Times New Roman" w:cs="Times New Roman"/>
+          <w:sz w:val="24"/>
+          <w:szCs w:val="24"/>
+        </w:rPr>
+        <w:t xml:space="preserve"> </w:t>
+      </w:r>
+      <w:r>
+        <w:rPr>
+          <w:rFonts w:ascii="Times New Roman" w:hAnsi="Times New Roman" w:cs="Times New Roman"/>
+          <w:sz w:val="24"/>
+          <w:szCs w:val="24"/>
+        </w:rPr>
+        <w:t>product,</w:t>
+      </w:r>
+      <w:r>
+        <w:rPr>
+          <w:rFonts w:ascii="Times New Roman" w:hAnsi="Times New Roman" w:cs="Times New Roman"/>
+          <w:sz w:val="24"/>
+          <w:szCs w:val="24"/>
+        </w:rPr>
+        <w:t xml:space="preserve"> </w:t>
+      </w:r>
+      <w:r>
+        <w:rPr>
+          <w:rFonts w:ascii="Times New Roman" w:hAnsi="Times New Roman" w:cs="Times New Roman"/>
+          <w:sz w:val="24"/>
+          <w:szCs w:val="24"/>
+        </w:rPr>
+        <w:t xml:space="preserve">count(product) as </w:t>
+      </w:r>
+      <w:proofErr w:type="spellStart"/>
+      <w:r>
+        <w:rPr>
+          <w:rFonts w:ascii="Times New Roman" w:hAnsi="Times New Roman" w:cs="Times New Roman"/>
+          <w:sz w:val="24"/>
+          <w:szCs w:val="24"/>
+        </w:rPr>
+        <w:t>quantity_sold</w:t>
+      </w:r>
+      <w:proofErr w:type="spellEnd"/>
+      <w:r>
+        <w:rPr>
+          <w:rFonts w:ascii="Times New Roman" w:hAnsi="Times New Roman" w:cs="Times New Roman"/>
+          <w:sz w:val="24"/>
+          <w:szCs w:val="24"/>
+        </w:rPr>
+        <w:t>,</w:t>
+      </w:r>
+      <w:r>
+        <w:rPr>
+          <w:rFonts w:ascii="Times New Roman" w:hAnsi="Times New Roman" w:cs="Times New Roman"/>
+          <w:sz w:val="24"/>
+          <w:szCs w:val="24"/>
+        </w:rPr>
+        <w:t xml:space="preserve"> </w:t>
+      </w:r>
+      <w:proofErr w:type="gramStart"/>
+      <w:r>
+        <w:rPr>
+          <w:rFonts w:ascii="Times New Roman" w:hAnsi="Times New Roman" w:cs="Times New Roman"/>
+          <w:sz w:val="24"/>
+          <w:szCs w:val="24"/>
+        </w:rPr>
+        <w:t>sum(</w:t>
+      </w:r>
+      <w:proofErr w:type="gramEnd"/>
+      <w:r>
+        <w:rPr>
+          <w:rFonts w:ascii="Times New Roman" w:hAnsi="Times New Roman" w:cs="Times New Roman"/>
+          <w:sz w:val="24"/>
+          <w:szCs w:val="24"/>
+        </w:rPr>
+        <w:t xml:space="preserve">quantity * price) as </w:t>
+      </w:r>
+      <w:proofErr w:type="spellStart"/>
+      <w:r>
+        <w:rPr>
+          <w:rFonts w:ascii="Times New Roman" w:hAnsi="Times New Roman" w:cs="Times New Roman"/>
+          <w:sz w:val="24"/>
+          <w:szCs w:val="24"/>
+        </w:rPr>
+        <w:t>total_sales</w:t>
+      </w:r>
+      <w:proofErr w:type="spellEnd"/>
+      <w:r>
+        <w:rPr>
+          <w:rFonts w:ascii="Times New Roman" w:hAnsi="Times New Roman" w:cs="Times New Roman"/>
+          <w:sz w:val="24"/>
+          <w:szCs w:val="24"/>
+        </w:rPr>
+        <w:t xml:space="preserve"> </w:t>
+      </w:r>
+      <w:r>
+        <w:rPr>
+          <w:rFonts w:ascii="Times New Roman" w:hAnsi="Times New Roman" w:cs="Times New Roman"/>
+          <w:sz w:val="24"/>
+          <w:szCs w:val="24"/>
+        </w:rPr>
+        <w:t>from</w:t>
+      </w:r>
+      <w:r>
+        <w:rPr>
+          <w:rFonts w:ascii="Times New Roman" w:hAnsi="Times New Roman" w:cs="Times New Roman"/>
+          <w:sz w:val="24"/>
+          <w:szCs w:val="24"/>
+        </w:rPr>
+        <w:t xml:space="preserve"> </w:t>
+      </w:r>
+      <w:proofErr w:type="spellStart"/>
+      <w:r>
+        <w:rPr>
+          <w:rFonts w:ascii="Times New Roman" w:hAnsi="Times New Roman" w:cs="Times New Roman"/>
+          <w:sz w:val="24"/>
+          <w:szCs w:val="24"/>
+        </w:rPr>
+        <w:t>customer_orders</w:t>
+      </w:r>
+      <w:proofErr w:type="spellEnd"/>
+      <w:r>
+        <w:rPr>
+          <w:rFonts w:ascii="Times New Roman" w:hAnsi="Times New Roman" w:cs="Times New Roman"/>
+          <w:sz w:val="24"/>
+          <w:szCs w:val="24"/>
+        </w:rPr>
+        <w:t xml:space="preserve"> </w:t>
+      </w:r>
+      <w:r>
+        <w:rPr>
+          <w:rFonts w:ascii="Times New Roman" w:hAnsi="Times New Roman" w:cs="Times New Roman"/>
+          <w:sz w:val="24"/>
+          <w:szCs w:val="24"/>
+        </w:rPr>
+        <w:t>group by</w:t>
+      </w:r>
+      <w:r>
+        <w:rPr>
+          <w:rFonts w:ascii="Times New Roman" w:hAnsi="Times New Roman" w:cs="Times New Roman"/>
+          <w:sz w:val="24"/>
+          <w:szCs w:val="24"/>
+        </w:rPr>
+        <w:t xml:space="preserve"> </w:t>
+      </w:r>
+      <w:proofErr w:type="gramStart"/>
+      <w:r>
+        <w:rPr>
+          <w:rFonts w:ascii="Times New Roman" w:hAnsi="Times New Roman" w:cs="Times New Roman"/>
+          <w:sz w:val="24"/>
+          <w:szCs w:val="24"/>
+        </w:rPr>
+        <w:t>product;</w:t>
+      </w:r>
+      <w:proofErr w:type="gramEnd"/>
+    </w:p>
+    <w:p>
+      <w:pPr>
+        <w:pStyle w:val="ListParagraph"/>
+        <w:ind w:left="2160"/>
+        <w:jc w:val="both"/>
+        <w:rPr>
+          <w:rFonts w:ascii="Times New Roman" w:hAnsi="Times New Roman" w:cs="Times New Roman"/>
+          <w:sz w:val="24"/>
+          <w:szCs w:val="24"/>
+        </w:rPr>
+      </w:pPr>
+      <w:r>
+        <w:rPr>
+          <w:rFonts w:ascii="Times New Roman" w:hAnsi="Times New Roman" w:cs="Times New Roman"/>
           <w:noProof/>
-          <w:sz w:val="28"/>
-          <w:szCs w:val="28"/>
-        </w:rPr>
-        <w:t xml:space="preserve"> </w:t>
-      </w:r>
-    </w:p>
-    <w:p>
-      <w:pPr>
-        <w:pStyle w:val="ListParagraph"/>
-        <w:ind w:left="1440"/>
-        <w:jc w:val="both"/>
-        <w:rPr>
-          <w:rFonts w:ascii="Times New Roman" w:hAnsi="Times New Roman" w:cs="Times New Roman"/>
-          <w:b/>
-          <w:bCs/>
-          <w:sz w:val="28"/>
-          <w:szCs w:val="28"/>
-        </w:rPr>
-      </w:pPr>
-      <w:r>
-        <w:rPr>
-          <w:rFonts w:ascii="Times New Roman" w:hAnsi="Times New Roman" w:cs="Times New Roman"/>
-          <w:b/>
-          <w:bCs/>
-          <w:noProof/>
-          <w:sz w:val="28"/>
-          <w:szCs w:val="28"/>
+          <w:sz w:val="24"/>
+          <w:szCs w:val="24"/>
         </w:rPr>
         <w:drawing>
-          <wp:inline distT="0" distB="0" distL="0" distR="0" wp14:anchorId="5A345CCF" wp14:editId="4EBDB105">
-            <wp:extent cx="3238500" cy="993861"/>
-            <wp:effectExtent l="0" t="0" r="0" b="0"/>
-            <wp:docPr id="1943367226" name="Picture 5"/>
+          <wp:inline distT="0" distB="0" distL="0" distR="0" wp14:anchorId="3CFA703B" wp14:editId="25AC1416">
+            <wp:extent cx="3197225" cy="1177925"/>
+            <wp:effectExtent l="0" t="0" r="3175" b="3175"/>
+            <wp:docPr id="47140970" name="Picture 5"/>
             <wp:cNvGraphicFramePr>
               <a:graphicFrameLocks xmlns:a="http://schemas.openxmlformats.org/drawingml/2006/main" noChangeAspect="1"/>
             </wp:cNvGraphicFramePr>
@@ -2422,8 +2601,10 @@
               <a:graphicData uri="http://schemas.openxmlformats.org/drawingml/2006/picture">
                 <pic:pic xmlns:pic="http://schemas.openxmlformats.org/drawingml/2006/picture">
                   <pic:nvPicPr>
-                    <pic:cNvPr id="1943367226" name="Picture 1943367226"/>
-                    <pic:cNvPicPr/>
+                    <pic:cNvPr id="0" name="Picture 5"/>
+                    <pic:cNvPicPr>
+                      <a:picLocks noChangeAspect="1" noChangeArrowheads="1"/>
+                    </pic:cNvPicPr>
                   </pic:nvPicPr>
                   <pic:blipFill>
                     <a:blip r:embed="rId12">
@@ -2433,18 +2614,23 @@
                         </a:ext>
                       </a:extLst>
                     </a:blip>
+                    <a:srcRect/>
                     <a:stretch>
                       <a:fillRect/>
                     </a:stretch>
                   </pic:blipFill>
-                  <pic:spPr>
+                  <pic:spPr bwMode="auto">
                     <a:xfrm>
                       <a:off x="0" y="0"/>
-                      <a:ext cx="3284410" cy="1007950"/>
+                      <a:ext cx="3214784" cy="1184394"/>
                     </a:xfrm>
                     <a:prstGeom prst="rect">
                       <a:avLst/>
                     </a:prstGeom>
+                    <a:noFill/>
+                    <a:ln>
+                      <a:noFill/>
+                    </a:ln>
                   </pic:spPr>
                 </pic:pic>
               </a:graphicData>
@@ -2456,14 +2642,771 @@
     <w:p>
       <w:pPr>
         <w:pStyle w:val="ListParagraph"/>
-        <w:ind w:left="1440"/>
-        <w:jc w:val="both"/>
-        <w:rPr>
-          <w:rFonts w:ascii="Times New Roman" w:hAnsi="Times New Roman" w:cs="Times New Roman"/>
-          <w:b/>
-          <w:bCs/>
-          <w:sz w:val="28"/>
-          <w:szCs w:val="28"/>
+        <w:jc w:val="both"/>
+        <w:rPr>
+          <w:rFonts w:ascii="Times New Roman" w:hAnsi="Times New Roman" w:cs="Times New Roman"/>
+          <w:sz w:val="24"/>
+          <w:szCs w:val="24"/>
+        </w:rPr>
+      </w:pPr>
+    </w:p>
+    <w:p>
+      <w:pPr>
+        <w:pStyle w:val="ListParagraph"/>
+        <w:numPr>
+          <w:ilvl w:val="1"/>
+          <w:numId w:val="18"/>
+        </w:numPr>
+        <w:jc w:val="both"/>
+        <w:rPr>
+          <w:rFonts w:ascii="Times New Roman" w:hAnsi="Times New Roman" w:cs="Times New Roman"/>
+          <w:sz w:val="28"/>
+          <w:szCs w:val="28"/>
+        </w:rPr>
+      </w:pPr>
+      <w:r>
+        <w:rPr>
+          <w:rFonts w:ascii="Times New Roman" w:hAnsi="Times New Roman" w:cs="Times New Roman"/>
+          <w:sz w:val="28"/>
+          <w:szCs w:val="28"/>
+        </w:rPr>
+        <w:t>Applying conditions on aggregate data:</w:t>
+      </w:r>
+    </w:p>
+    <w:p>
+      <w:pPr>
+        <w:pStyle w:val="ListParagraph"/>
+        <w:numPr>
+          <w:ilvl w:val="2"/>
+          <w:numId w:val="18"/>
+        </w:numPr>
+        <w:jc w:val="both"/>
+        <w:rPr>
+          <w:rFonts w:ascii="Times New Roman" w:hAnsi="Times New Roman" w:cs="Times New Roman"/>
+          <w:sz w:val="24"/>
+          <w:szCs w:val="24"/>
+        </w:rPr>
+      </w:pPr>
+      <w:r>
+        <w:rPr>
+          <w:rFonts w:ascii="Times New Roman" w:hAnsi="Times New Roman" w:cs="Times New Roman"/>
+          <w:sz w:val="24"/>
+          <w:szCs w:val="24"/>
+        </w:rPr>
+        <w:t>Select</w:t>
+      </w:r>
+      <w:r>
+        <w:rPr>
+          <w:rFonts w:ascii="Times New Roman" w:hAnsi="Times New Roman" w:cs="Times New Roman"/>
+          <w:sz w:val="24"/>
+          <w:szCs w:val="24"/>
+        </w:rPr>
+        <w:t xml:space="preserve"> </w:t>
+      </w:r>
+      <w:r>
+        <w:rPr>
+          <w:rFonts w:ascii="Times New Roman" w:hAnsi="Times New Roman" w:cs="Times New Roman"/>
+          <w:sz w:val="24"/>
+          <w:szCs w:val="24"/>
+        </w:rPr>
+        <w:t>product,</w:t>
+      </w:r>
+      <w:r>
+        <w:rPr>
+          <w:rFonts w:ascii="Times New Roman" w:hAnsi="Times New Roman" w:cs="Times New Roman"/>
+          <w:sz w:val="24"/>
+          <w:szCs w:val="24"/>
+        </w:rPr>
+        <w:t xml:space="preserve"> </w:t>
+      </w:r>
+      <w:r>
+        <w:rPr>
+          <w:rFonts w:ascii="Times New Roman" w:hAnsi="Times New Roman" w:cs="Times New Roman"/>
+          <w:sz w:val="24"/>
+          <w:szCs w:val="24"/>
+        </w:rPr>
+        <w:t xml:space="preserve">sum(quantity) as </w:t>
+      </w:r>
+      <w:proofErr w:type="spellStart"/>
+      <w:r>
+        <w:rPr>
+          <w:rFonts w:ascii="Times New Roman" w:hAnsi="Times New Roman" w:cs="Times New Roman"/>
+          <w:sz w:val="24"/>
+          <w:szCs w:val="24"/>
+        </w:rPr>
+        <w:t>quantity_sold</w:t>
+      </w:r>
+      <w:proofErr w:type="spellEnd"/>
+      <w:r>
+        <w:rPr>
+          <w:rFonts w:ascii="Times New Roman" w:hAnsi="Times New Roman" w:cs="Times New Roman"/>
+          <w:sz w:val="24"/>
+          <w:szCs w:val="24"/>
+        </w:rPr>
+        <w:t>,</w:t>
+      </w:r>
+      <w:r>
+        <w:rPr>
+          <w:rFonts w:ascii="Times New Roman" w:hAnsi="Times New Roman" w:cs="Times New Roman"/>
+          <w:sz w:val="24"/>
+          <w:szCs w:val="24"/>
+        </w:rPr>
+        <w:t xml:space="preserve"> </w:t>
+      </w:r>
+      <w:proofErr w:type="gramStart"/>
+      <w:r>
+        <w:rPr>
+          <w:rFonts w:ascii="Times New Roman" w:hAnsi="Times New Roman" w:cs="Times New Roman"/>
+          <w:sz w:val="24"/>
+          <w:szCs w:val="24"/>
+        </w:rPr>
+        <w:t>sum(</w:t>
+      </w:r>
+      <w:proofErr w:type="gramEnd"/>
+      <w:r>
+        <w:rPr>
+          <w:rFonts w:ascii="Times New Roman" w:hAnsi="Times New Roman" w:cs="Times New Roman"/>
+          <w:sz w:val="24"/>
+          <w:szCs w:val="24"/>
+        </w:rPr>
+        <w:t xml:space="preserve">quantity * price) as </w:t>
+      </w:r>
+      <w:proofErr w:type="spellStart"/>
+      <w:r>
+        <w:rPr>
+          <w:rFonts w:ascii="Times New Roman" w:hAnsi="Times New Roman" w:cs="Times New Roman"/>
+          <w:sz w:val="24"/>
+          <w:szCs w:val="24"/>
+        </w:rPr>
+        <w:t>total_sales</w:t>
+      </w:r>
+      <w:proofErr w:type="spellEnd"/>
+      <w:r>
+        <w:rPr>
+          <w:rFonts w:ascii="Times New Roman" w:hAnsi="Times New Roman" w:cs="Times New Roman"/>
+          <w:sz w:val="24"/>
+          <w:szCs w:val="24"/>
+        </w:rPr>
+        <w:t xml:space="preserve"> </w:t>
+      </w:r>
+      <w:r>
+        <w:rPr>
+          <w:rFonts w:ascii="Times New Roman" w:hAnsi="Times New Roman" w:cs="Times New Roman"/>
+          <w:sz w:val="24"/>
+          <w:szCs w:val="24"/>
+        </w:rPr>
+        <w:t>from</w:t>
+      </w:r>
+      <w:r>
+        <w:rPr>
+          <w:rFonts w:ascii="Times New Roman" w:hAnsi="Times New Roman" w:cs="Times New Roman"/>
+          <w:sz w:val="24"/>
+          <w:szCs w:val="24"/>
+        </w:rPr>
+        <w:t xml:space="preserve"> </w:t>
+      </w:r>
+      <w:proofErr w:type="spellStart"/>
+      <w:r>
+        <w:rPr>
+          <w:rFonts w:ascii="Times New Roman" w:hAnsi="Times New Roman" w:cs="Times New Roman"/>
+          <w:sz w:val="24"/>
+          <w:szCs w:val="24"/>
+        </w:rPr>
+        <w:t>customer_orders</w:t>
+      </w:r>
+      <w:proofErr w:type="spellEnd"/>
+      <w:r>
+        <w:rPr>
+          <w:rFonts w:ascii="Times New Roman" w:hAnsi="Times New Roman" w:cs="Times New Roman"/>
+          <w:sz w:val="24"/>
+          <w:szCs w:val="24"/>
+        </w:rPr>
+        <w:t xml:space="preserve"> </w:t>
+      </w:r>
+      <w:r>
+        <w:rPr>
+          <w:rFonts w:ascii="Times New Roman" w:hAnsi="Times New Roman" w:cs="Times New Roman"/>
+          <w:sz w:val="24"/>
+          <w:szCs w:val="24"/>
+        </w:rPr>
+        <w:t>group by</w:t>
+      </w:r>
+      <w:r>
+        <w:rPr>
+          <w:rFonts w:ascii="Times New Roman" w:hAnsi="Times New Roman" w:cs="Times New Roman"/>
+          <w:sz w:val="24"/>
+          <w:szCs w:val="24"/>
+        </w:rPr>
+        <w:t xml:space="preserve"> </w:t>
+      </w:r>
+      <w:r>
+        <w:rPr>
+          <w:rFonts w:ascii="Times New Roman" w:hAnsi="Times New Roman" w:cs="Times New Roman"/>
+          <w:sz w:val="24"/>
+          <w:szCs w:val="24"/>
+        </w:rPr>
+        <w:t>product</w:t>
+      </w:r>
+      <w:r>
+        <w:rPr>
+          <w:rFonts w:ascii="Times New Roman" w:hAnsi="Times New Roman" w:cs="Times New Roman"/>
+          <w:sz w:val="24"/>
+          <w:szCs w:val="24"/>
+        </w:rPr>
+        <w:t xml:space="preserve"> </w:t>
+      </w:r>
+      <w:r>
+        <w:rPr>
+          <w:rFonts w:ascii="Times New Roman" w:hAnsi="Times New Roman" w:cs="Times New Roman"/>
+          <w:sz w:val="24"/>
+          <w:szCs w:val="24"/>
+        </w:rPr>
+        <w:t>having</w:t>
+      </w:r>
+      <w:r>
+        <w:rPr>
+          <w:rFonts w:ascii="Times New Roman" w:hAnsi="Times New Roman" w:cs="Times New Roman"/>
+          <w:sz w:val="24"/>
+          <w:szCs w:val="24"/>
+        </w:rPr>
+        <w:t xml:space="preserve"> </w:t>
+      </w:r>
+      <w:r>
+        <w:rPr>
+          <w:rFonts w:ascii="Times New Roman" w:hAnsi="Times New Roman" w:cs="Times New Roman"/>
+          <w:sz w:val="24"/>
+          <w:szCs w:val="24"/>
+        </w:rPr>
+        <w:t xml:space="preserve">sum(quantity) &gt;= </w:t>
+      </w:r>
+      <w:proofErr w:type="gramStart"/>
+      <w:r>
+        <w:rPr>
+          <w:rFonts w:ascii="Times New Roman" w:hAnsi="Times New Roman" w:cs="Times New Roman"/>
+          <w:sz w:val="24"/>
+          <w:szCs w:val="24"/>
+        </w:rPr>
+        <w:t>5</w:t>
+      </w:r>
+      <w:r>
+        <w:rPr>
+          <w:rFonts w:ascii="Times New Roman" w:hAnsi="Times New Roman" w:cs="Times New Roman"/>
+          <w:sz w:val="24"/>
+          <w:szCs w:val="24"/>
+        </w:rPr>
+        <w:t>;</w:t>
+      </w:r>
+      <w:proofErr w:type="gramEnd"/>
+    </w:p>
+    <w:p>
+      <w:pPr>
+        <w:pStyle w:val="ListParagraph"/>
+        <w:ind w:left="2160"/>
+        <w:jc w:val="both"/>
+        <w:rPr>
+          <w:rFonts w:ascii="Times New Roman" w:hAnsi="Times New Roman" w:cs="Times New Roman"/>
+          <w:sz w:val="24"/>
+          <w:szCs w:val="24"/>
+        </w:rPr>
+      </w:pPr>
+      <w:r>
+        <w:rPr>
+          <w:rFonts w:ascii="Times New Roman" w:hAnsi="Times New Roman" w:cs="Times New Roman"/>
+          <w:noProof/>
+          <w:sz w:val="24"/>
+          <w:szCs w:val="24"/>
+        </w:rPr>
+        <w:drawing>
+          <wp:inline distT="0" distB="0" distL="0" distR="0" wp14:anchorId="789686A9" wp14:editId="72D14F90">
+            <wp:extent cx="3215640" cy="1004555"/>
+            <wp:effectExtent l="0" t="0" r="3810" b="5715"/>
+            <wp:docPr id="498109325" name="Picture 6"/>
+            <wp:cNvGraphicFramePr>
+              <a:graphicFrameLocks xmlns:a="http://schemas.openxmlformats.org/drawingml/2006/main" noChangeAspect="1"/>
+            </wp:cNvGraphicFramePr>
+            <a:graphic xmlns:a="http://schemas.openxmlformats.org/drawingml/2006/main">
+              <a:graphicData uri="http://schemas.openxmlformats.org/drawingml/2006/picture">
+                <pic:pic xmlns:pic="http://schemas.openxmlformats.org/drawingml/2006/picture">
+                  <pic:nvPicPr>
+                    <pic:cNvPr id="0" name="Picture 6"/>
+                    <pic:cNvPicPr>
+                      <a:picLocks noChangeAspect="1" noChangeArrowheads="1"/>
+                    </pic:cNvPicPr>
+                  </pic:nvPicPr>
+                  <pic:blipFill>
+                    <a:blip r:embed="rId13">
+                      <a:extLst>
+                        <a:ext uri="{28A0092B-C50C-407E-A947-70E740481C1C}">
+                          <a14:useLocalDpi xmlns:a14="http://schemas.microsoft.com/office/drawing/2010/main" val="0"/>
+                        </a:ext>
+                      </a:extLst>
+                    </a:blip>
+                    <a:srcRect/>
+                    <a:stretch>
+                      <a:fillRect/>
+                    </a:stretch>
+                  </pic:blipFill>
+                  <pic:spPr bwMode="auto">
+                    <a:xfrm>
+                      <a:off x="0" y="0"/>
+                      <a:ext cx="3227962" cy="1008404"/>
+                    </a:xfrm>
+                    <a:prstGeom prst="rect">
+                      <a:avLst/>
+                    </a:prstGeom>
+                    <a:noFill/>
+                    <a:ln>
+                      <a:noFill/>
+                    </a:ln>
+                  </pic:spPr>
+                </pic:pic>
+              </a:graphicData>
+            </a:graphic>
+          </wp:inline>
+        </w:drawing>
+      </w:r>
+    </w:p>
+    <w:p>
+      <w:pPr>
+        <w:pStyle w:val="ListParagraph"/>
+        <w:ind w:left="2160"/>
+        <w:jc w:val="both"/>
+        <w:rPr>
+          <w:rFonts w:ascii="Times New Roman" w:hAnsi="Times New Roman" w:cs="Times New Roman"/>
+          <w:sz w:val="24"/>
+          <w:szCs w:val="24"/>
+        </w:rPr>
+      </w:pPr>
+    </w:p>
+    <w:p>
+      <w:pPr>
+        <w:pStyle w:val="ListParagraph"/>
+        <w:numPr>
+          <w:ilvl w:val="1"/>
+          <w:numId w:val="18"/>
+        </w:numPr>
+        <w:jc w:val="both"/>
+        <w:rPr>
+          <w:rFonts w:ascii="Times New Roman" w:hAnsi="Times New Roman" w:cs="Times New Roman"/>
+          <w:sz w:val="24"/>
+          <w:szCs w:val="24"/>
+        </w:rPr>
+      </w:pPr>
+      <w:r>
+        <w:rPr>
+          <w:rFonts w:ascii="Times New Roman" w:hAnsi="Times New Roman" w:cs="Times New Roman"/>
+          <w:sz w:val="28"/>
+          <w:szCs w:val="28"/>
+        </w:rPr>
+        <w:t>Filtering vs Aggregation Conditions</w:t>
+      </w:r>
+    </w:p>
+    <w:p>
+      <w:pPr>
+        <w:pStyle w:val="ListParagraph"/>
+        <w:numPr>
+          <w:ilvl w:val="2"/>
+          <w:numId w:val="18"/>
+        </w:numPr>
+        <w:jc w:val="both"/>
+        <w:rPr>
+          <w:rFonts w:ascii="Times New Roman" w:hAnsi="Times New Roman" w:cs="Times New Roman"/>
+          <w:sz w:val="24"/>
+          <w:szCs w:val="24"/>
+        </w:rPr>
+      </w:pPr>
+      <w:r>
+        <w:rPr>
+          <w:rFonts w:ascii="Times New Roman" w:hAnsi="Times New Roman" w:cs="Times New Roman"/>
+          <w:sz w:val="28"/>
+          <w:szCs w:val="28"/>
+        </w:rPr>
+        <w:t>Filtering</w:t>
+      </w:r>
+      <w:r>
+        <w:rPr>
+          <w:rFonts w:ascii="Times New Roman" w:hAnsi="Times New Roman" w:cs="Times New Roman"/>
+          <w:sz w:val="24"/>
+          <w:szCs w:val="24"/>
+        </w:rPr>
+        <w:t xml:space="preserve">: </w:t>
+      </w:r>
+      <w:r>
+        <w:rPr>
+          <w:rFonts w:ascii="Times New Roman" w:hAnsi="Times New Roman" w:cs="Times New Roman"/>
+          <w:sz w:val="24"/>
+          <w:szCs w:val="24"/>
+        </w:rPr>
+        <w:t>S</w:t>
+      </w:r>
+      <w:r>
+        <w:rPr>
+          <w:rFonts w:ascii="Times New Roman" w:hAnsi="Times New Roman" w:cs="Times New Roman"/>
+          <w:sz w:val="24"/>
+          <w:szCs w:val="24"/>
+        </w:rPr>
+        <w:t xml:space="preserve">elect product, </w:t>
+      </w:r>
+      <w:proofErr w:type="gramStart"/>
+      <w:r>
+        <w:rPr>
+          <w:rFonts w:ascii="Times New Roman" w:hAnsi="Times New Roman" w:cs="Times New Roman"/>
+          <w:sz w:val="24"/>
+          <w:szCs w:val="24"/>
+        </w:rPr>
+        <w:t>sum(</w:t>
+      </w:r>
+      <w:proofErr w:type="gramEnd"/>
+      <w:r>
+        <w:rPr>
+          <w:rFonts w:ascii="Times New Roman" w:hAnsi="Times New Roman" w:cs="Times New Roman"/>
+          <w:sz w:val="24"/>
+          <w:szCs w:val="24"/>
+        </w:rPr>
+        <w:t xml:space="preserve">quantity * price) as </w:t>
+      </w:r>
+      <w:proofErr w:type="spellStart"/>
+      <w:r>
+        <w:rPr>
+          <w:rFonts w:ascii="Times New Roman" w:hAnsi="Times New Roman" w:cs="Times New Roman"/>
+          <w:sz w:val="24"/>
+          <w:szCs w:val="24"/>
+        </w:rPr>
+        <w:t>total_sales</w:t>
+      </w:r>
+      <w:proofErr w:type="spellEnd"/>
+      <w:r>
+        <w:rPr>
+          <w:rFonts w:ascii="Times New Roman" w:hAnsi="Times New Roman" w:cs="Times New Roman"/>
+          <w:sz w:val="24"/>
+          <w:szCs w:val="24"/>
+        </w:rPr>
+        <w:t xml:space="preserve"> from </w:t>
+      </w:r>
+      <w:proofErr w:type="spellStart"/>
+      <w:r>
+        <w:rPr>
+          <w:rFonts w:ascii="Times New Roman" w:hAnsi="Times New Roman" w:cs="Times New Roman"/>
+          <w:sz w:val="24"/>
+          <w:szCs w:val="24"/>
+        </w:rPr>
+        <w:t>customer_orders</w:t>
+      </w:r>
+      <w:proofErr w:type="spellEnd"/>
+      <w:r>
+        <w:rPr>
+          <w:rFonts w:ascii="Times New Roman" w:hAnsi="Times New Roman" w:cs="Times New Roman"/>
+          <w:sz w:val="24"/>
+          <w:szCs w:val="24"/>
+        </w:rPr>
+        <w:t xml:space="preserve"> where quantity &gt;= 2</w:t>
+      </w:r>
+      <w:r>
+        <w:rPr>
+          <w:rFonts w:ascii="Times New Roman" w:hAnsi="Times New Roman" w:cs="Times New Roman"/>
+          <w:sz w:val="24"/>
+          <w:szCs w:val="24"/>
+        </w:rPr>
+        <w:t xml:space="preserve"> </w:t>
+      </w:r>
+      <w:r>
+        <w:rPr>
+          <w:rFonts w:ascii="Times New Roman" w:hAnsi="Times New Roman" w:cs="Times New Roman"/>
+          <w:sz w:val="24"/>
+          <w:szCs w:val="24"/>
+        </w:rPr>
+        <w:t xml:space="preserve">group by </w:t>
+      </w:r>
+      <w:proofErr w:type="gramStart"/>
+      <w:r>
+        <w:rPr>
+          <w:rFonts w:ascii="Times New Roman" w:hAnsi="Times New Roman" w:cs="Times New Roman"/>
+          <w:sz w:val="24"/>
+          <w:szCs w:val="24"/>
+        </w:rPr>
+        <w:t>product;</w:t>
+      </w:r>
+      <w:proofErr w:type="gramEnd"/>
+    </w:p>
+    <w:p>
+      <w:pPr>
+        <w:pStyle w:val="ListParagraph"/>
+        <w:ind w:left="2160"/>
+        <w:jc w:val="both"/>
+        <w:rPr>
+          <w:rFonts w:ascii="Times New Roman" w:hAnsi="Times New Roman" w:cs="Times New Roman"/>
+          <w:sz w:val="24"/>
+          <w:szCs w:val="24"/>
+        </w:rPr>
+      </w:pPr>
+      <w:r>
+        <w:rPr>
+          <w:rFonts w:ascii="Times New Roman" w:hAnsi="Times New Roman" w:cs="Times New Roman"/>
+          <w:noProof/>
+          <w:sz w:val="24"/>
+          <w:szCs w:val="24"/>
+        </w:rPr>
+        <w:drawing>
+          <wp:inline distT="0" distB="0" distL="0" distR="0" wp14:anchorId="591896FA" wp14:editId="72311150">
+            <wp:extent cx="3215640" cy="1636790"/>
+            <wp:effectExtent l="0" t="0" r="3810" b="1905"/>
+            <wp:docPr id="866797279" name="Picture 7"/>
+            <wp:cNvGraphicFramePr>
+              <a:graphicFrameLocks xmlns:a="http://schemas.openxmlformats.org/drawingml/2006/main" noChangeAspect="1"/>
+            </wp:cNvGraphicFramePr>
+            <a:graphic xmlns:a="http://schemas.openxmlformats.org/drawingml/2006/main">
+              <a:graphicData uri="http://schemas.openxmlformats.org/drawingml/2006/picture">
+                <pic:pic xmlns:pic="http://schemas.openxmlformats.org/drawingml/2006/picture">
+                  <pic:nvPicPr>
+                    <pic:cNvPr id="0" name="Picture 7"/>
+                    <pic:cNvPicPr>
+                      <a:picLocks noChangeAspect="1" noChangeArrowheads="1"/>
+                    </pic:cNvPicPr>
+                  </pic:nvPicPr>
+                  <pic:blipFill>
+                    <a:blip r:embed="rId14">
+                      <a:extLst>
+                        <a:ext uri="{28A0092B-C50C-407E-A947-70E740481C1C}">
+                          <a14:useLocalDpi xmlns:a14="http://schemas.microsoft.com/office/drawing/2010/main" val="0"/>
+                        </a:ext>
+                      </a:extLst>
+                    </a:blip>
+                    <a:srcRect/>
+                    <a:stretch>
+                      <a:fillRect/>
+                    </a:stretch>
+                  </pic:blipFill>
+                  <pic:spPr bwMode="auto">
+                    <a:xfrm>
+                      <a:off x="0" y="0"/>
+                      <a:ext cx="3225068" cy="1641589"/>
+                    </a:xfrm>
+                    <a:prstGeom prst="rect">
+                      <a:avLst/>
+                    </a:prstGeom>
+                    <a:noFill/>
+                    <a:ln>
+                      <a:noFill/>
+                    </a:ln>
+                  </pic:spPr>
+                </pic:pic>
+              </a:graphicData>
+            </a:graphic>
+          </wp:inline>
+        </w:drawing>
+      </w:r>
+    </w:p>
+    <w:p>
+      <w:pPr>
+        <w:pStyle w:val="ListParagraph"/>
+        <w:ind w:left="2160"/>
+        <w:jc w:val="both"/>
+        <w:rPr>
+          <w:rFonts w:ascii="Times New Roman" w:hAnsi="Times New Roman" w:cs="Times New Roman"/>
+          <w:sz w:val="24"/>
+          <w:szCs w:val="24"/>
+        </w:rPr>
+      </w:pPr>
+    </w:p>
+    <w:p>
+      <w:pPr>
+        <w:pStyle w:val="ListParagraph"/>
+        <w:numPr>
+          <w:ilvl w:val="2"/>
+          <w:numId w:val="18"/>
+        </w:numPr>
+        <w:jc w:val="both"/>
+        <w:rPr>
+          <w:rFonts w:ascii="Times New Roman" w:hAnsi="Times New Roman" w:cs="Times New Roman"/>
+          <w:sz w:val="24"/>
+          <w:szCs w:val="24"/>
+        </w:rPr>
+      </w:pPr>
+      <w:r>
+        <w:rPr>
+          <w:rFonts w:ascii="Times New Roman" w:hAnsi="Times New Roman" w:cs="Times New Roman"/>
+          <w:sz w:val="28"/>
+          <w:szCs w:val="28"/>
+        </w:rPr>
+        <w:lastRenderedPageBreak/>
+        <w:t xml:space="preserve">Aggregation Conditions: </w:t>
+      </w:r>
+      <w:r>
+        <w:rPr>
+          <w:rFonts w:ascii="Times New Roman" w:hAnsi="Times New Roman" w:cs="Times New Roman"/>
+          <w:sz w:val="24"/>
+          <w:szCs w:val="24"/>
+        </w:rPr>
+        <w:t>S</w:t>
+      </w:r>
+      <w:r>
+        <w:rPr>
+          <w:rFonts w:ascii="Times New Roman" w:hAnsi="Times New Roman" w:cs="Times New Roman"/>
+          <w:sz w:val="24"/>
+          <w:szCs w:val="24"/>
+        </w:rPr>
+        <w:t xml:space="preserve">elect product, </w:t>
+      </w:r>
+      <w:proofErr w:type="gramStart"/>
+      <w:r>
+        <w:rPr>
+          <w:rFonts w:ascii="Times New Roman" w:hAnsi="Times New Roman" w:cs="Times New Roman"/>
+          <w:sz w:val="24"/>
+          <w:szCs w:val="24"/>
+        </w:rPr>
+        <w:t>sum(</w:t>
+      </w:r>
+      <w:proofErr w:type="gramEnd"/>
+      <w:r>
+        <w:rPr>
+          <w:rFonts w:ascii="Times New Roman" w:hAnsi="Times New Roman" w:cs="Times New Roman"/>
+          <w:sz w:val="24"/>
+          <w:szCs w:val="24"/>
+        </w:rPr>
+        <w:t xml:space="preserve">quantity * price) as </w:t>
+      </w:r>
+      <w:proofErr w:type="spellStart"/>
+      <w:r>
+        <w:rPr>
+          <w:rFonts w:ascii="Times New Roman" w:hAnsi="Times New Roman" w:cs="Times New Roman"/>
+          <w:sz w:val="24"/>
+          <w:szCs w:val="24"/>
+        </w:rPr>
+        <w:t>total_sales</w:t>
+      </w:r>
+      <w:proofErr w:type="spellEnd"/>
+      <w:r>
+        <w:rPr>
+          <w:rFonts w:ascii="Times New Roman" w:hAnsi="Times New Roman" w:cs="Times New Roman"/>
+          <w:sz w:val="24"/>
+          <w:szCs w:val="24"/>
+        </w:rPr>
+        <w:t xml:space="preserve"> from </w:t>
+      </w:r>
+      <w:proofErr w:type="spellStart"/>
+      <w:r>
+        <w:rPr>
+          <w:rFonts w:ascii="Times New Roman" w:hAnsi="Times New Roman" w:cs="Times New Roman"/>
+          <w:sz w:val="24"/>
+          <w:szCs w:val="24"/>
+        </w:rPr>
+        <w:t>customer_orders</w:t>
+      </w:r>
+      <w:proofErr w:type="spellEnd"/>
+      <w:r>
+        <w:rPr>
+          <w:rFonts w:ascii="Times New Roman" w:hAnsi="Times New Roman" w:cs="Times New Roman"/>
+          <w:sz w:val="24"/>
+          <w:szCs w:val="24"/>
+        </w:rPr>
+        <w:t xml:space="preserve"> group by product having </w:t>
+      </w:r>
+      <w:proofErr w:type="gramStart"/>
+      <w:r>
+        <w:rPr>
+          <w:rFonts w:ascii="Times New Roman" w:hAnsi="Times New Roman" w:cs="Times New Roman"/>
+          <w:sz w:val="24"/>
+          <w:szCs w:val="24"/>
+        </w:rPr>
+        <w:t>sum(</w:t>
+      </w:r>
+      <w:proofErr w:type="gramEnd"/>
+      <w:r>
+        <w:rPr>
+          <w:rFonts w:ascii="Times New Roman" w:hAnsi="Times New Roman" w:cs="Times New Roman"/>
+          <w:sz w:val="24"/>
+          <w:szCs w:val="24"/>
+        </w:rPr>
+        <w:t xml:space="preserve">quantity * price) &gt; </w:t>
+      </w:r>
+      <w:proofErr w:type="gramStart"/>
+      <w:r>
+        <w:rPr>
+          <w:rFonts w:ascii="Times New Roman" w:hAnsi="Times New Roman" w:cs="Times New Roman"/>
+          <w:sz w:val="24"/>
+          <w:szCs w:val="24"/>
+        </w:rPr>
+        <w:t>50000;</w:t>
+      </w:r>
+      <w:proofErr w:type="gramEnd"/>
+    </w:p>
+    <w:p>
+      <w:pPr>
+        <w:pStyle w:val="ListParagraph"/>
+        <w:ind w:left="2160"/>
+        <w:jc w:val="both"/>
+        <w:rPr>
+          <w:rFonts w:ascii="Times New Roman" w:hAnsi="Times New Roman" w:cs="Times New Roman"/>
+          <w:sz w:val="24"/>
+          <w:szCs w:val="24"/>
+        </w:rPr>
+      </w:pPr>
+      <w:r>
+        <w:rPr>
+          <w:rFonts w:ascii="Times New Roman" w:hAnsi="Times New Roman" w:cs="Times New Roman"/>
+          <w:noProof/>
+          <w:sz w:val="24"/>
+          <w:szCs w:val="24"/>
+        </w:rPr>
+        <w:drawing>
+          <wp:inline distT="0" distB="0" distL="0" distR="0" wp14:anchorId="0524F854" wp14:editId="01C2F532">
+            <wp:extent cx="3215640" cy="1567897"/>
+            <wp:effectExtent l="0" t="0" r="3810" b="0"/>
+            <wp:docPr id="813608887" name="Picture 8"/>
+            <wp:cNvGraphicFramePr>
+              <a:graphicFrameLocks xmlns:a="http://schemas.openxmlformats.org/drawingml/2006/main" noChangeAspect="1"/>
+            </wp:cNvGraphicFramePr>
+            <a:graphic xmlns:a="http://schemas.openxmlformats.org/drawingml/2006/main">
+              <a:graphicData uri="http://schemas.openxmlformats.org/drawingml/2006/picture">
+                <pic:pic xmlns:pic="http://schemas.openxmlformats.org/drawingml/2006/picture">
+                  <pic:nvPicPr>
+                    <pic:cNvPr id="0" name="Picture 8"/>
+                    <pic:cNvPicPr>
+                      <a:picLocks noChangeAspect="1" noChangeArrowheads="1"/>
+                    </pic:cNvPicPr>
+                  </pic:nvPicPr>
+                  <pic:blipFill>
+                    <a:blip r:embed="rId15">
+                      <a:extLst>
+                        <a:ext uri="{28A0092B-C50C-407E-A947-70E740481C1C}">
+                          <a14:useLocalDpi xmlns:a14="http://schemas.microsoft.com/office/drawing/2010/main" val="0"/>
+                        </a:ext>
+                      </a:extLst>
+                    </a:blip>
+                    <a:srcRect/>
+                    <a:stretch>
+                      <a:fillRect/>
+                    </a:stretch>
+                  </pic:blipFill>
+                  <pic:spPr bwMode="auto">
+                    <a:xfrm>
+                      <a:off x="0" y="0"/>
+                      <a:ext cx="3218856" cy="1569465"/>
+                    </a:xfrm>
+                    <a:prstGeom prst="rect">
+                      <a:avLst/>
+                    </a:prstGeom>
+                    <a:noFill/>
+                    <a:ln>
+                      <a:noFill/>
+                    </a:ln>
+                  </pic:spPr>
+                </pic:pic>
+              </a:graphicData>
+            </a:graphic>
+          </wp:inline>
+        </w:drawing>
+      </w:r>
+    </w:p>
+    <w:p>
+      <w:pPr>
+        <w:pStyle w:val="ListParagraph"/>
+        <w:ind w:left="2160"/>
+        <w:jc w:val="both"/>
+        <w:rPr>
+          <w:rFonts w:ascii="Times New Roman" w:hAnsi="Times New Roman" w:cs="Times New Roman"/>
+          <w:sz w:val="24"/>
+          <w:szCs w:val="24"/>
         </w:rPr>
       </w:pPr>
     </w:p>
@@ -2477,31 +3420,19 @@
         <w:jc w:val="both"/>
         <w:rPr>
           <w:rFonts w:ascii="Times New Roman" w:hAnsi="Times New Roman" w:cs="Times New Roman"/>
+          <w:sz w:val="24"/>
+          <w:szCs w:val="24"/>
+        </w:rPr>
+      </w:pPr>
+      <w:r>
+        <w:rPr>
+          <w:rFonts w:ascii="Times New Roman" w:hAnsi="Times New Roman" w:cs="Times New Roman"/>
           <w:b/>
           <w:bCs/>
           <w:sz w:val="28"/>
           <w:szCs w:val="28"/>
         </w:rPr>
-      </w:pPr>
-      <w:r>
-        <w:rPr>
-          <w:rFonts w:ascii="Times New Roman" w:hAnsi="Times New Roman" w:cs="Times New Roman"/>
-          <w:b/>
-          <w:bCs/>
-          <w:sz w:val="28"/>
-          <w:szCs w:val="28"/>
-        </w:rPr>
-        <w:t>Learning Outcom</w:t>
-      </w:r>
-      <w:r>
-        <w:rPr>
-          <w:rFonts w:ascii="Times New Roman" w:hAnsi="Times New Roman" w:cs="Times New Roman"/>
-          <w:b/>
-          <w:bCs/>
-          <w:sz w:val="28"/>
-          <w:szCs w:val="28"/>
-        </w:rPr>
-        <w:t>e</w:t>
+        <w:t>Input/Output Details:</w:t>
       </w:r>
     </w:p>
     <w:p>
@@ -2514,28 +3445,49 @@
         <w:jc w:val="both"/>
         <w:rPr>
           <w:rFonts w:ascii="Times New Roman" w:hAnsi="Times New Roman" w:cs="Times New Roman"/>
-          <w:sz w:val="28"/>
-          <w:szCs w:val="28"/>
-          <w:lang w:val="en-GB"/>
-        </w:rPr>
-      </w:pPr>
-      <w:r>
-        <w:rPr>
-          <w:rFonts w:ascii="Times New Roman" w:hAnsi="Times New Roman" w:cs="Times New Roman"/>
-          <w:sz w:val="28"/>
-          <w:szCs w:val="28"/>
-          <w:lang w:val="en-GB"/>
-        </w:rPr>
-        <w:t>U</w:t>
-      </w:r>
-      <w:r>
-        <w:rPr>
-          <w:rFonts w:ascii="Times New Roman" w:hAnsi="Times New Roman" w:cs="Times New Roman"/>
-          <w:sz w:val="28"/>
-          <w:szCs w:val="28"/>
-          <w:lang w:val="en-GB"/>
-        </w:rPr>
-        <w:t>nderstand how data can be filtered to retrieve only relevant records from a database.</w:t>
+          <w:sz w:val="24"/>
+          <w:szCs w:val="24"/>
+        </w:rPr>
+      </w:pPr>
+      <w:r>
+        <w:rPr>
+          <w:rFonts w:ascii="Times New Roman" w:hAnsi="Times New Roman" w:cs="Times New Roman"/>
+          <w:sz w:val="28"/>
+          <w:szCs w:val="28"/>
+        </w:rPr>
+        <w:t xml:space="preserve">The input for the experiment </w:t>
+      </w:r>
+      <w:r>
+        <w:rPr>
+          <w:rFonts w:ascii="Times New Roman" w:hAnsi="Times New Roman" w:cs="Times New Roman"/>
+          <w:sz w:val="28"/>
+          <w:szCs w:val="28"/>
+        </w:rPr>
+        <w:t>is</w:t>
+      </w:r>
+      <w:r>
+        <w:rPr>
+          <w:rFonts w:ascii="Times New Roman" w:hAnsi="Times New Roman" w:cs="Times New Roman"/>
+          <w:sz w:val="28"/>
+          <w:szCs w:val="28"/>
+        </w:rPr>
+        <w:t xml:space="preserve"> the SQL queries mentioned in Experiment Steps</w:t>
+      </w:r>
+      <w:r>
+        <w:rPr>
+          <w:rFonts w:ascii="Times New Roman" w:hAnsi="Times New Roman" w:cs="Times New Roman"/>
+          <w:sz w:val="28"/>
+          <w:szCs w:val="28"/>
+        </w:rPr>
+        <w:t xml:space="preserve"> </w:t>
+      </w:r>
+      <w:r>
+        <w:rPr>
+          <w:rFonts w:ascii="Times New Roman" w:hAnsi="Times New Roman" w:cs="Times New Roman"/>
+          <w:sz w:val="28"/>
+          <w:szCs w:val="28"/>
+        </w:rPr>
+        <w:t>(5).</w:t>
       </w:r>
     </w:p>
     <w:p>
@@ -2548,28 +3500,78 @@
         <w:jc w:val="both"/>
         <w:rPr>
           <w:rFonts w:ascii="Times New Roman" w:hAnsi="Times New Roman" w:cs="Times New Roman"/>
-          <w:sz w:val="28"/>
-          <w:szCs w:val="28"/>
-          <w:lang w:val="en-GB"/>
-        </w:rPr>
-      </w:pPr>
-      <w:r>
-        <w:rPr>
-          <w:rFonts w:ascii="Times New Roman" w:hAnsi="Times New Roman" w:cs="Times New Roman"/>
-          <w:sz w:val="28"/>
-          <w:szCs w:val="28"/>
-          <w:lang w:val="en-GB"/>
-        </w:rPr>
-        <w:t>L</w:t>
-      </w:r>
-      <w:r>
-        <w:rPr>
-          <w:rFonts w:ascii="Times New Roman" w:hAnsi="Times New Roman" w:cs="Times New Roman"/>
-          <w:sz w:val="28"/>
-          <w:szCs w:val="28"/>
-          <w:lang w:val="en-GB"/>
-        </w:rPr>
-        <w:t>earn how sorting improves readability and usefulness of query results in reports.</w:t>
+          <w:sz w:val="24"/>
+          <w:szCs w:val="24"/>
+        </w:rPr>
+      </w:pPr>
+      <w:r>
+        <w:rPr>
+          <w:rFonts w:ascii="Times New Roman" w:hAnsi="Times New Roman" w:cs="Times New Roman"/>
+          <w:sz w:val="28"/>
+          <w:szCs w:val="28"/>
+        </w:rPr>
+        <w:t>The output for each query is attached after the query itself.</w:t>
+      </w:r>
+    </w:p>
+    <w:p>
+      <w:pPr>
+        <w:pStyle w:val="ListParagraph"/>
+        <w:ind w:left="2160"/>
+        <w:jc w:val="both"/>
+        <w:rPr>
+          <w:rFonts w:ascii="Times New Roman" w:hAnsi="Times New Roman" w:cs="Times New Roman"/>
+          <w:sz w:val="24"/>
+          <w:szCs w:val="24"/>
+        </w:rPr>
+      </w:pPr>
+    </w:p>
+    <w:p>
+      <w:pPr>
+        <w:pStyle w:val="ListParagraph"/>
+        <w:ind w:left="2160"/>
+        <w:jc w:val="both"/>
+        <w:rPr>
+          <w:rFonts w:ascii="Times New Roman" w:hAnsi="Times New Roman" w:cs="Times New Roman"/>
+          <w:sz w:val="24"/>
+          <w:szCs w:val="24"/>
+        </w:rPr>
+      </w:pPr>
+    </w:p>
+    <w:p>
+      <w:pPr>
+        <w:pStyle w:val="ListParagraph"/>
+        <w:numPr>
+          <w:ilvl w:val="0"/>
+          <w:numId w:val="18"/>
+        </w:numPr>
+        <w:jc w:val="both"/>
+        <w:rPr>
+          <w:rFonts w:ascii="Times New Roman" w:hAnsi="Times New Roman" w:cs="Times New Roman"/>
+          <w:b/>
+          <w:bCs/>
+          <w:sz w:val="28"/>
+          <w:szCs w:val="28"/>
+        </w:rPr>
+      </w:pPr>
+      <w:r>
+        <w:rPr>
+          <w:rFonts w:ascii="Times New Roman" w:hAnsi="Times New Roman" w:cs="Times New Roman"/>
+          <w:b/>
+          <w:bCs/>
+          <w:sz w:val="28"/>
+          <w:szCs w:val="28"/>
+        </w:rPr>
+        <w:t>Learning Outcom</w:t>
+      </w:r>
+      <w:r>
+        <w:rPr>
+          <w:rFonts w:ascii="Times New Roman" w:hAnsi="Times New Roman" w:cs="Times New Roman"/>
+          <w:b/>
+          <w:bCs/>
+          <w:sz w:val="28"/>
+          <w:szCs w:val="28"/>
+        </w:rPr>
+        <w:t>e</w:t>
       </w:r>
     </w:p>
     <w:p>
@@ -2594,7 +3596,7 @@
           <w:szCs w:val="28"/>
           <w:lang w:val="en-GB"/>
         </w:rPr>
-        <w:t>G</w:t>
+        <w:t>U</w:t>
       </w:r>
       <w:r>
         <w:rPr>
@@ -2603,25 +3605,7 @@
           <w:szCs w:val="28"/>
           <w:lang w:val="en-GB"/>
         </w:rPr>
-        <w:t>ain</w:t>
-      </w:r>
-      <w:r>
-        <w:rPr>
-          <w:rFonts w:ascii="Times New Roman" w:hAnsi="Times New Roman" w:cs="Times New Roman"/>
-          <w:sz w:val="28"/>
-          <w:szCs w:val="28"/>
-          <w:lang w:val="en-GB"/>
-        </w:rPr>
-        <w:t>ed</w:t>
-      </w:r>
-      <w:r>
-        <w:rPr>
-          <w:rFonts w:ascii="Times New Roman" w:hAnsi="Times New Roman" w:cs="Times New Roman"/>
-          <w:sz w:val="28"/>
-          <w:szCs w:val="28"/>
-          <w:lang w:val="en-GB"/>
-        </w:rPr>
-        <w:t xml:space="preserve"> the ability to group data for analytical purposes.</w:t>
+        <w:t>nderstand how data can be filtered to retrieve only relevant records from a database.</w:t>
       </w:r>
     </w:p>
     <w:p>
@@ -2646,7 +3630,7 @@
           <w:szCs w:val="28"/>
           <w:lang w:val="en-GB"/>
         </w:rPr>
-        <w:t>D</w:t>
+        <w:t>L</w:t>
       </w:r>
       <w:r>
         <w:rPr>
@@ -2655,7 +3639,7 @@
           <w:szCs w:val="28"/>
           <w:lang w:val="en-GB"/>
         </w:rPr>
-        <w:t>ifferentiate between row-level conditions and group-level conditions.</w:t>
+        <w:t>earn how sorting improves readability and usefulness of query results in reports.</w:t>
       </w:r>
     </w:p>
     <w:p>
@@ -2680,7 +3664,7 @@
           <w:szCs w:val="28"/>
           <w:lang w:val="en-GB"/>
         </w:rPr>
-        <w:t>W</w:t>
+        <w:t>G</w:t>
       </w:r>
       <w:r>
         <w:rPr>
@@ -2689,7 +3673,25 @@
           <w:szCs w:val="28"/>
           <w:lang w:val="en-GB"/>
         </w:rPr>
-        <w:t>riting analytical SQL queries used in real-world scenarios.</w:t>
+        <w:t>ain</w:t>
+      </w:r>
+      <w:r>
+        <w:rPr>
+          <w:rFonts w:ascii="Times New Roman" w:hAnsi="Times New Roman" w:cs="Times New Roman"/>
+          <w:sz w:val="28"/>
+          <w:szCs w:val="28"/>
+          <w:lang w:val="en-GB"/>
+        </w:rPr>
+        <w:t>ed</w:t>
+      </w:r>
+      <w:r>
+        <w:rPr>
+          <w:rFonts w:ascii="Times New Roman" w:hAnsi="Times New Roman" w:cs="Times New Roman"/>
+          <w:sz w:val="28"/>
+          <w:szCs w:val="28"/>
+          <w:lang w:val="en-GB"/>
+        </w:rPr>
+        <w:t xml:space="preserve"> the ability to group data for analytical purposes.</w:t>
       </w:r>
     </w:p>
     <w:p>
@@ -2714,6 +3716,74 @@
           <w:szCs w:val="28"/>
           <w:lang w:val="en-GB"/>
         </w:rPr>
+        <w:t>D</w:t>
+      </w:r>
+      <w:r>
+        <w:rPr>
+          <w:rFonts w:ascii="Times New Roman" w:hAnsi="Times New Roman" w:cs="Times New Roman"/>
+          <w:sz w:val="28"/>
+          <w:szCs w:val="28"/>
+          <w:lang w:val="en-GB"/>
+        </w:rPr>
+        <w:t>ifferentiate between row-level conditions and group-level conditions.</w:t>
+      </w:r>
+    </w:p>
+    <w:p>
+      <w:pPr>
+        <w:pStyle w:val="ListParagraph"/>
+        <w:numPr>
+          <w:ilvl w:val="1"/>
+          <w:numId w:val="18"/>
+        </w:numPr>
+        <w:jc w:val="both"/>
+        <w:rPr>
+          <w:rFonts w:ascii="Times New Roman" w:hAnsi="Times New Roman" w:cs="Times New Roman"/>
+          <w:sz w:val="28"/>
+          <w:szCs w:val="28"/>
+          <w:lang w:val="en-GB"/>
+        </w:rPr>
+      </w:pPr>
+      <w:r>
+        <w:rPr>
+          <w:rFonts w:ascii="Times New Roman" w:hAnsi="Times New Roman" w:cs="Times New Roman"/>
+          <w:sz w:val="28"/>
+          <w:szCs w:val="28"/>
+          <w:lang w:val="en-GB"/>
+        </w:rPr>
+        <w:t>W</w:t>
+      </w:r>
+      <w:r>
+        <w:rPr>
+          <w:rFonts w:ascii="Times New Roman" w:hAnsi="Times New Roman" w:cs="Times New Roman"/>
+          <w:sz w:val="28"/>
+          <w:szCs w:val="28"/>
+          <w:lang w:val="en-GB"/>
+        </w:rPr>
+        <w:t>riting analytical SQL queries used in real-world scenarios.</w:t>
+      </w:r>
+    </w:p>
+    <w:p>
+      <w:pPr>
+        <w:pStyle w:val="ListParagraph"/>
+        <w:numPr>
+          <w:ilvl w:val="1"/>
+          <w:numId w:val="18"/>
+        </w:numPr>
+        <w:jc w:val="both"/>
+        <w:rPr>
+          <w:rFonts w:ascii="Times New Roman" w:hAnsi="Times New Roman" w:cs="Times New Roman"/>
+          <w:sz w:val="28"/>
+          <w:szCs w:val="28"/>
+          <w:lang w:val="en-GB"/>
+        </w:rPr>
+      </w:pPr>
+      <w:r>
+        <w:rPr>
+          <w:rFonts w:ascii="Times New Roman" w:hAnsi="Times New Roman" w:cs="Times New Roman"/>
+          <w:sz w:val="28"/>
+          <w:szCs w:val="28"/>
+          <w:lang w:val="en-GB"/>
+        </w:rPr>
         <w:t>B</w:t>
       </w:r>
       <w:r>
@@ -2725,16 +3795,6 @@
         </w:rPr>
         <w:t>etter prepared to answer SQL-based questions related to filtering, grouping, and aggregation.</w:t>
       </w:r>
-    </w:p>
-    <w:p>
-      <w:pPr>
-        <w:jc w:val="both"/>
-        <w:rPr>
-          <w:rFonts w:ascii="Times New Roman" w:hAnsi="Times New Roman" w:cs="Times New Roman"/>
-          <w:sz w:val="28"/>
-          <w:szCs w:val="28"/>
-        </w:rPr>
-      </w:pPr>
     </w:p>
     <w:p>
       <w:pPr>
@@ -2749,10 +3809,10 @@
       </w:pPr>
     </w:p>
     <w:sectPr>
-      <w:headerReference w:type="even" r:id="rId13"/>
-      <w:headerReference w:type="default" r:id="rId14"/>
-      <w:footerReference w:type="even" r:id="rId15"/>
-      <w:footerReference w:type="default" r:id="rId16"/>
+      <w:headerReference w:type="even" r:id="rId16"/>
+      <w:headerReference w:type="default" r:id="rId17"/>
+      <w:footerReference w:type="even" r:id="rId18"/>
+      <w:footerReference w:type="default" r:id="rId19"/>
       <w:pgSz w:w="11906" w:h="16838" w:code="9"/>
       <w:pgMar w:top="720" w:right="720" w:bottom="0" w:left="720" w:header="0" w:footer="0" w:gutter="0"/>
       <w:cols w:space="720"/>
@@ -4568,8 +5628,8 @@
   <w:abstractNum w:abstractNumId="15" w15:restartNumberingAfterBreak="0">
     <w:nsid w:val="71005608"/>
     <w:multiLevelType w:val="hybridMultilevel"/>
-    <w:tmpl w:val="40EA9D3E"/>
-    <w:lvl w:ilvl="0" w:tplc="4009000F">
+    <w:tmpl w:val="F84E688C"/>
+    <w:lvl w:ilvl="0" w:tplc="35124016">
       <w:start w:val="1"/>
       <w:numFmt w:val="decimal"/>
       <w:lvlText w:val="%1."/>
@@ -4577,8 +5637,14 @@
       <w:pPr>
         <w:ind w:left="720" w:hanging="360"/>
       </w:pPr>
-    </w:lvl>
-    <w:lvl w:ilvl="1" w:tplc="E4FE6250">
+      <w:rPr>
+        <w:b/>
+        <w:bCs/>
+        <w:sz w:val="28"/>
+        <w:szCs w:val="28"/>
+      </w:rPr>
+    </w:lvl>
+    <w:lvl w:ilvl="1" w:tplc="A210E5C6">
       <w:start w:val="1"/>
       <w:numFmt w:val="lowerLetter"/>
       <w:lvlText w:val="%2."/>
@@ -4589,6 +5655,8 @@
       <w:rPr>
         <w:b w:val="0"/>
         <w:bCs w:val="0"/>
+        <w:sz w:val="28"/>
+        <w:szCs w:val="28"/>
       </w:rPr>
     </w:lvl>
     <w:lvl w:ilvl="2" w:tplc="4009001B">

</xml_diff>